<commit_message>
Align earthquake input prompt formatting
Adjusted console prompt text in the earthquake request flow for cleaner alignment and more consistent wording in validation re-prompts (especially around damage level and yes/no fields). Also updated the scoring documentation document to reflect the latest assignment changes.

I also added a link to the Repository in the documentation.
</commit_message>
<xml_diff>
--- a/Relief Supply Distribution System Scoring Documentation.docx
+++ b/Relief Supply Distribution System Scoring Documentation.docx
@@ -22,7 +22,7 @@
       </w:r>
     </w:p>
     <w:p>
-      <w:hyperlink r:id="rId5" w:history="1">
+      <w:hyperlink w:history="1" r:id="rId5">
         <w:r>
           <w:rPr>
             <w:rStyle w:val="Hyperlink"/>
@@ -341,7 +341,8 @@
         <w:pStyle w:val="Heading3"/>
       </w:pPr>
       <w:r>
-        <w:t>1.3 Access points (A), 0 or 100</w:t>
+        <w:rPr/>
+        <w:t>1.3 Complexity points (C), 0 or 100</w:t>
       </w:r>
     </w:p>
     <w:p>
@@ -381,7 +382,8 @@
     </w:p>
     <w:p>
       <w:r>
-        <w:t>N = (0.5 × People Points) + (0.4 × Impact Points) + (0.1 × Access Points)</w:t>
+        <w:rPr/>
+        <w:t>N = (0.5 × People Points) + (0.4 × Impact Points) + (0.1 × Complexity Points)</w:t>
       </w:r>
     </w:p>
     <w:p>
@@ -397,7 +399,8 @@
     </w:p>
     <w:p>
       <w:r>
-        <w:t>Category weights: People 50%, Impact 40%, Access 10%. Maximum N = 50 + 40 + 10 = 100.</w:t>
+        <w:rPr/>
+        <w:t>Category weights: People 50%, Impact 40%, Complexity 10%. Maximum N = 50 + 40 + 10 = 100.</w:t>
       </w:r>
     </w:p>
     <w:p>
@@ -435,7 +438,8 @@
         <w:tc>
           <w:tcPr>
             <w:tcW w:w="3120" w:type="dxa"/>
-            <w:shd w:val="clear" w:color="auto" w:fill="F2F2F2"/>
+            <w:shd w:val="clear" w:color="auto" w:fill="F2F2F2" w:themeFill="background1" w:themeFillShade="F2"/>
+            <w:tcMar/>
           </w:tcPr>
           <w:p>
             <w:r>
@@ -446,7 +450,8 @@
         <w:tc>
           <w:tcPr>
             <w:tcW w:w="3120" w:type="dxa"/>
-            <w:shd w:val="clear" w:color="auto" w:fill="F2F2F2"/>
+            <w:shd w:val="clear" w:color="auto" w:fill="F2F2F2" w:themeFill="background1" w:themeFillShade="F2"/>
+            <w:tcMar/>
           </w:tcPr>
           <w:p>
             <w:r>
@@ -457,7 +462,8 @@
         <w:tc>
           <w:tcPr>
             <w:tcW w:w="3120" w:type="dxa"/>
-            <w:shd w:val="clear" w:color="auto" w:fill="F2F2F2"/>
+            <w:shd w:val="clear" w:color="auto" w:fill="F2F2F2" w:themeFill="background1" w:themeFillShade="F2"/>
+            <w:tcMar/>
           </w:tcPr>
           <w:p>
             <w:r>
@@ -470,6 +476,7 @@
         <w:tc>
           <w:tcPr>
             <w:tcW w:w="3120" w:type="dxa"/>
+            <w:tcMar/>
           </w:tcPr>
           <w:p>
             <w:r>
@@ -480,17 +487,19 @@
         <w:tc>
           <w:tcPr>
             <w:tcW w:w="3120" w:type="dxa"/>
-          </w:tcPr>
-          <w:p>
-            <w:r>
+            <w:tcMar/>
+          </w:tcPr>
+          <w:p>
+            <w:r>
+              <w:rPr/>
               <w:t xml:space="preserve">30 (of </w:t>
             </w:r>
-            <w:proofErr w:type="spellStart"/>
-            <w:r>
-              <w:t>Pepole</w:t>
-            </w:r>
-            <w:proofErr w:type="spellEnd"/>
-            <w:r>
+            <w:r>
+              <w:rPr/>
+              <w:t>People</w:t>
+            </w:r>
+            <w:r>
+              <w:rPr/>
               <w:t xml:space="preserve"> Points)</w:t>
             </w:r>
           </w:p>
@@ -498,6 +507,7 @@
         <w:tc>
           <w:tcPr>
             <w:tcW w:w="3120" w:type="dxa"/>
+            <w:tcMar/>
           </w:tcPr>
           <w:p>
             <w:r>
@@ -510,6 +520,7 @@
         <w:tc>
           <w:tcPr>
             <w:tcW w:w="3120" w:type="dxa"/>
+            <w:tcMar/>
           </w:tcPr>
           <w:p>
             <w:r>
@@ -520,17 +531,19 @@
         <w:tc>
           <w:tcPr>
             <w:tcW w:w="3120" w:type="dxa"/>
-          </w:tcPr>
-          <w:p>
-            <w:r>
+            <w:tcMar/>
+          </w:tcPr>
+          <w:p>
+            <w:r>
+              <w:rPr/>
               <w:t xml:space="preserve">25 (of </w:t>
             </w:r>
-            <w:proofErr w:type="spellStart"/>
-            <w:r>
-              <w:t>Pepole</w:t>
-            </w:r>
-            <w:proofErr w:type="spellEnd"/>
-            <w:r>
+            <w:r>
+              <w:rPr/>
+              <w:t>People</w:t>
+            </w:r>
+            <w:r>
+              <w:rPr/>
               <w:t xml:space="preserve"> Points)</w:t>
             </w:r>
           </w:p>
@@ -538,6 +551,7 @@
         <w:tc>
           <w:tcPr>
             <w:tcW w:w="3120" w:type="dxa"/>
+            <w:tcMar/>
           </w:tcPr>
           <w:p>
             <w:r>
@@ -550,6 +564,7 @@
         <w:tc>
           <w:tcPr>
             <w:tcW w:w="3120" w:type="dxa"/>
+            <w:tcMar/>
           </w:tcPr>
           <w:p>
             <w:r>
@@ -560,17 +575,19 @@
         <w:tc>
           <w:tcPr>
             <w:tcW w:w="3120" w:type="dxa"/>
-          </w:tcPr>
-          <w:p>
-            <w:r>
+            <w:tcMar/>
+          </w:tcPr>
+          <w:p>
+            <w:r>
+              <w:rPr/>
               <w:t xml:space="preserve">15 (of </w:t>
             </w:r>
-            <w:proofErr w:type="spellStart"/>
-            <w:r>
-              <w:t>Pepole</w:t>
-            </w:r>
-            <w:proofErr w:type="spellEnd"/>
-            <w:r>
+            <w:r>
+              <w:rPr/>
+              <w:t>People</w:t>
+            </w:r>
+            <w:r>
+              <w:rPr/>
               <w:t xml:space="preserve"> Points)</w:t>
             </w:r>
           </w:p>
@@ -578,6 +595,7 @@
         <w:tc>
           <w:tcPr>
             <w:tcW w:w="3120" w:type="dxa"/>
+            <w:tcMar/>
           </w:tcPr>
           <w:p>
             <w:r>
@@ -590,6 +608,7 @@
         <w:tc>
           <w:tcPr>
             <w:tcW w:w="3120" w:type="dxa"/>
+            <w:tcMar/>
           </w:tcPr>
           <w:p>
             <w:r>
@@ -600,17 +619,19 @@
         <w:tc>
           <w:tcPr>
             <w:tcW w:w="3120" w:type="dxa"/>
-          </w:tcPr>
-          <w:p>
-            <w:r>
+            <w:tcMar/>
+          </w:tcPr>
+          <w:p>
+            <w:r>
+              <w:rPr/>
               <w:t xml:space="preserve">10 (of </w:t>
             </w:r>
-            <w:proofErr w:type="spellStart"/>
-            <w:r>
-              <w:t>Pepole</w:t>
-            </w:r>
-            <w:proofErr w:type="spellEnd"/>
-            <w:r>
+            <w:r>
+              <w:rPr/>
+              <w:t>People</w:t>
+            </w:r>
+            <w:r>
+              <w:rPr/>
               <w:t xml:space="preserve"> Points)</w:t>
             </w:r>
           </w:p>
@@ -618,6 +639,7 @@
         <w:tc>
           <w:tcPr>
             <w:tcW w:w="3120" w:type="dxa"/>
+            <w:tcMar/>
           </w:tcPr>
           <w:p>
             <w:r>
@@ -630,6 +652,7 @@
         <w:tc>
           <w:tcPr>
             <w:tcW w:w="3120" w:type="dxa"/>
+            <w:tcMar/>
           </w:tcPr>
           <w:p>
             <w:r>
@@ -640,17 +663,19 @@
         <w:tc>
           <w:tcPr>
             <w:tcW w:w="3120" w:type="dxa"/>
-          </w:tcPr>
-          <w:p>
-            <w:r>
+            <w:tcMar/>
+          </w:tcPr>
+          <w:p>
+            <w:r>
+              <w:rPr/>
               <w:t xml:space="preserve">5–20 (of </w:t>
             </w:r>
-            <w:proofErr w:type="spellStart"/>
-            <w:r>
-              <w:t>Pepole</w:t>
-            </w:r>
-            <w:proofErr w:type="spellEnd"/>
-            <w:r>
+            <w:r>
+              <w:rPr/>
+              <w:t>People</w:t>
+            </w:r>
+            <w:r>
+              <w:rPr/>
               <w:t xml:space="preserve"> Points)</w:t>
             </w:r>
           </w:p>
@@ -658,6 +683,7 @@
         <w:tc>
           <w:tcPr>
             <w:tcW w:w="3120" w:type="dxa"/>
+            <w:tcMar/>
           </w:tcPr>
           <w:p>
             <w:r>
@@ -670,6 +696,7 @@
         <w:tc>
           <w:tcPr>
             <w:tcW w:w="3120" w:type="dxa"/>
+            <w:tcMar/>
           </w:tcPr>
           <w:p>
             <w:r>
@@ -680,6 +707,7 @@
         <w:tc>
           <w:tcPr>
             <w:tcW w:w="3120" w:type="dxa"/>
+            <w:tcMar/>
           </w:tcPr>
           <w:p>
             <w:r>
@@ -690,6 +718,7 @@
         <w:tc>
           <w:tcPr>
             <w:tcW w:w="3120" w:type="dxa"/>
+            <w:tcMar/>
           </w:tcPr>
           <w:p>
             <w:r>
@@ -702,6 +731,7 @@
         <w:tc>
           <w:tcPr>
             <w:tcW w:w="3120" w:type="dxa"/>
+            <w:tcMar/>
           </w:tcPr>
           <w:p>
             <w:r>
@@ -712,6 +742,7 @@
         <w:tc>
           <w:tcPr>
             <w:tcW w:w="3120" w:type="dxa"/>
+            <w:tcMar/>
           </w:tcPr>
           <w:p>
             <w:r>
@@ -722,6 +753,7 @@
         <w:tc>
           <w:tcPr>
             <w:tcW w:w="3120" w:type="dxa"/>
+            <w:tcMar/>
           </w:tcPr>
           <w:p>
             <w:r>
@@ -734,6 +766,7 @@
         <w:tc>
           <w:tcPr>
             <w:tcW w:w="3120" w:type="dxa"/>
+            <w:tcMar/>
           </w:tcPr>
           <w:p>
             <w:r>
@@ -744,16 +777,19 @@
         <w:tc>
           <w:tcPr>
             <w:tcW w:w="3120" w:type="dxa"/>
-          </w:tcPr>
-          <w:p>
-            <w:r>
-              <w:t>100 (of Access Points)</w:t>
-            </w:r>
-          </w:p>
-        </w:tc>
-        <w:tc>
-          <w:tcPr>
-            <w:tcW w:w="3120" w:type="dxa"/>
+            <w:tcMar/>
+          </w:tcPr>
+          <w:p>
+            <w:r>
+              <w:rPr/>
+              <w:t>100 (of Complexity Points)</w:t>
+            </w:r>
+          </w:p>
+        </w:tc>
+        <w:tc>
+          <w:tcPr>
+            <w:tcW w:w="3120" w:type="dxa"/>
+            <w:tcMar/>
           </w:tcPr>
           <w:p>
             <w:r>
@@ -766,6 +802,7 @@
         <w:tc>
           <w:tcPr>
             <w:tcW w:w="3120" w:type="dxa"/>
+            <w:tcMar/>
           </w:tcPr>
           <w:p>
             <w:r>
@@ -776,6 +813,7 @@
         <w:tc>
           <w:tcPr>
             <w:tcW w:w="3120" w:type="dxa"/>
+            <w:tcMar/>
           </w:tcPr>
           <w:p>
             <w:r>
@@ -789,6 +827,7 @@
         <w:tc>
           <w:tcPr>
             <w:tcW w:w="3120" w:type="dxa"/>
+            <w:tcMar/>
           </w:tcPr>
           <w:p>
             <w:r>
@@ -803,7 +842,8 @@
     </w:tbl>
     <w:p>
       <w:r>
-        <w:t>Totals: People inputs 15 + 12.5 + 7.5 + 5 + 10 = 50. Impact inputs 24 + 16 = 40. Access 10.</w:t>
+        <w:rPr/>
+        <w:t>Totals: People inputs 15 + 12.5 + 7.5 + 5 + 10 = 50. Impact inputs 24 + 16 = 40. Complexity 10.</w:t>
       </w:r>
     </w:p>
     <w:p>
@@ -1548,12 +1588,15 @@
           <w:ilvl w:val="0"/>
           <w:numId w:val="8"/>
         </w:numPr>
-      </w:pPr>
-      <w:r>
+        <w:rPr/>
+      </w:pPr>
+      <w:r>
+        <w:rPr/>
         <w:t>Delivery difficulty adj</w:t>
       </w:r>
       <w:r>
-        <w:t>usts the response but does not measure suffering. Access carries the smallest weight (10%).</w:t>
+        <w:rPr/>
+        <w:t>usts the response but does not measure suffering. Complexity carries the smallest weight (10%).</w:t>
       </w:r>
     </w:p>
     <w:p>
@@ -1744,17 +1787,21 @@
     <w:p>
       <w:r>
         <w:rPr>
-          <w:b/>
+          <w:b w:val="1"/>
+          <w:bCs w:val="1"/>
         </w:rPr>
         <w:t>Road damaged: 100 raw, 10.0 final.</w:t>
       </w:r>
       <w:r>
+        <w:rPr/>
         <w:t xml:space="preserve"> A cut-off area cannot self-resupply, evacuate its injured or be reached by follow-up convoys, so relief must be sized for the delivery ef</w:t>
       </w:r>
       <w:r>
-        <w:t>fort. The weight is only 10% because road condition describes delivery difficulty, not human suffering. An accessible area with trapped people must outrank an unreachable area with no casualties. A damaged road alone, with no other risk factor, scores 17.3</w:t>
-      </w:r>
-      <w:r>
+        <w:rPr/>
+        <w:t>fort. The complexity weight is only 10% because road condition describes delivery difficulty, not human suffering. An accessible area with trapped people must outrank an unreachable area with no casualties. A damaged road alone, with no other risk factor, scores 17.3</w:t>
+      </w:r>
+      <w:r>
+        <w:rPr/>
         <w:t xml:space="preserve"> and does not trigger relief.</w:t>
       </w:r>
     </w:p>
@@ -2214,7 +2261,7 @@
       </w:r>
     </w:p>
     <w:sectPr>
-      <w:pgSz w:w="12240" w:h="15840"/>
+      <w:pgSz w:w="12240" w:h="15840" w:orient="portrait"/>
       <w:pgMar w:top="1440" w:right="1440" w:bottom="1440" w:left="1440" w:header="720" w:footer="720" w:gutter="0"/>
       <w:cols w:space="720"/>
     </w:sectPr>
@@ -2443,7 +2490,7 @@
   <w:docDefaults>
     <w:rPrDefault>
       <w:rPr>
-        <w:rFonts w:ascii="Calibri" w:eastAsia="Calibri" w:hAnsi="Calibri" w:cs="Calibri"/>
+        <w:rFonts w:ascii="Calibri" w:hAnsi="Calibri" w:eastAsia="Calibri" w:cs="Calibri"/>
         <w:sz w:val="22"/>
         <w:szCs w:val="22"/>
         <w:lang w:val="en-US" w:eastAsia="en-US" w:bidi="ar-SA"/>
@@ -2458,14 +2505,14 @@
   <w:latentStyles w:defLockedState="0" w:defUIPriority="99" w:defSemiHidden="0" w:defUnhideWhenUsed="0" w:defQFormat="0" w:count="376">
     <w:lsdException w:name="Normal" w:uiPriority="0" w:qFormat="1"/>
     <w:lsdException w:name="heading 1" w:uiPriority="9" w:qFormat="1"/>
-    <w:lsdException w:name="heading 2" w:semiHidden="1" w:uiPriority="9" w:unhideWhenUsed="1" w:qFormat="1"/>
-    <w:lsdException w:name="heading 3" w:semiHidden="1" w:uiPriority="9" w:unhideWhenUsed="1" w:qFormat="1"/>
-    <w:lsdException w:name="heading 4" w:semiHidden="1" w:uiPriority="9" w:unhideWhenUsed="1" w:qFormat="1"/>
-    <w:lsdException w:name="heading 5" w:semiHidden="1" w:uiPriority="9" w:unhideWhenUsed="1" w:qFormat="1"/>
-    <w:lsdException w:name="heading 6" w:semiHidden="1" w:uiPriority="9" w:unhideWhenUsed="1" w:qFormat="1"/>
-    <w:lsdException w:name="heading 7" w:semiHidden="1" w:uiPriority="9" w:unhideWhenUsed="1" w:qFormat="1"/>
-    <w:lsdException w:name="heading 8" w:semiHidden="1" w:uiPriority="9" w:unhideWhenUsed="1" w:qFormat="1"/>
-    <w:lsdException w:name="heading 9" w:semiHidden="1" w:uiPriority="9" w:unhideWhenUsed="1" w:qFormat="1"/>
+    <w:lsdException w:name="heading 2" w:uiPriority="9" w:semiHidden="1" w:unhideWhenUsed="1" w:qFormat="1"/>
+    <w:lsdException w:name="heading 3" w:uiPriority="9" w:semiHidden="1" w:unhideWhenUsed="1" w:qFormat="1"/>
+    <w:lsdException w:name="heading 4" w:uiPriority="9" w:semiHidden="1" w:unhideWhenUsed="1" w:qFormat="1"/>
+    <w:lsdException w:name="heading 5" w:uiPriority="9" w:semiHidden="1" w:unhideWhenUsed="1" w:qFormat="1"/>
+    <w:lsdException w:name="heading 6" w:uiPriority="9" w:semiHidden="1" w:unhideWhenUsed="1" w:qFormat="1"/>
+    <w:lsdException w:name="heading 7" w:uiPriority="9" w:semiHidden="1" w:unhideWhenUsed="1" w:qFormat="1"/>
+    <w:lsdException w:name="heading 8" w:uiPriority="9" w:semiHidden="1" w:unhideWhenUsed="1" w:qFormat="1"/>
+    <w:lsdException w:name="heading 9" w:uiPriority="9" w:semiHidden="1" w:unhideWhenUsed="1" w:qFormat="1"/>
     <w:lsdException w:name="index 1" w:semiHidden="1" w:unhideWhenUsed="1"/>
     <w:lsdException w:name="index 2" w:semiHidden="1" w:unhideWhenUsed="1"/>
     <w:lsdException w:name="index 3" w:semiHidden="1" w:unhideWhenUsed="1"/>
@@ -2475,22 +2522,22 @@
     <w:lsdException w:name="index 7" w:semiHidden="1" w:unhideWhenUsed="1"/>
     <w:lsdException w:name="index 8" w:semiHidden="1" w:unhideWhenUsed="1"/>
     <w:lsdException w:name="index 9" w:semiHidden="1" w:unhideWhenUsed="1"/>
-    <w:lsdException w:name="toc 1" w:semiHidden="1" w:uiPriority="39" w:unhideWhenUsed="1"/>
-    <w:lsdException w:name="toc 2" w:semiHidden="1" w:uiPriority="39" w:unhideWhenUsed="1"/>
-    <w:lsdException w:name="toc 3" w:semiHidden="1" w:uiPriority="39" w:unhideWhenUsed="1"/>
-    <w:lsdException w:name="toc 4" w:semiHidden="1" w:uiPriority="39" w:unhideWhenUsed="1"/>
-    <w:lsdException w:name="toc 5" w:semiHidden="1" w:uiPriority="39" w:unhideWhenUsed="1"/>
-    <w:lsdException w:name="toc 6" w:semiHidden="1" w:uiPriority="39" w:unhideWhenUsed="1"/>
-    <w:lsdException w:name="toc 7" w:semiHidden="1" w:uiPriority="39" w:unhideWhenUsed="1"/>
-    <w:lsdException w:name="toc 8" w:semiHidden="1" w:uiPriority="39" w:unhideWhenUsed="1"/>
-    <w:lsdException w:name="toc 9" w:semiHidden="1" w:uiPriority="39" w:unhideWhenUsed="1"/>
+    <w:lsdException w:name="toc 1" w:uiPriority="39" w:semiHidden="1" w:unhideWhenUsed="1"/>
+    <w:lsdException w:name="toc 2" w:uiPriority="39" w:semiHidden="1" w:unhideWhenUsed="1"/>
+    <w:lsdException w:name="toc 3" w:uiPriority="39" w:semiHidden="1" w:unhideWhenUsed="1"/>
+    <w:lsdException w:name="toc 4" w:uiPriority="39" w:semiHidden="1" w:unhideWhenUsed="1"/>
+    <w:lsdException w:name="toc 5" w:uiPriority="39" w:semiHidden="1" w:unhideWhenUsed="1"/>
+    <w:lsdException w:name="toc 6" w:uiPriority="39" w:semiHidden="1" w:unhideWhenUsed="1"/>
+    <w:lsdException w:name="toc 7" w:uiPriority="39" w:semiHidden="1" w:unhideWhenUsed="1"/>
+    <w:lsdException w:name="toc 8" w:uiPriority="39" w:semiHidden="1" w:unhideWhenUsed="1"/>
+    <w:lsdException w:name="toc 9" w:uiPriority="39" w:semiHidden="1" w:unhideWhenUsed="1"/>
     <w:lsdException w:name="Normal Indent" w:semiHidden="1" w:unhideWhenUsed="1"/>
     <w:lsdException w:name="footnote text" w:semiHidden="1" w:unhideWhenUsed="1"/>
     <w:lsdException w:name="annotation text" w:semiHidden="1" w:unhideWhenUsed="1"/>
     <w:lsdException w:name="header" w:semiHidden="1" w:unhideWhenUsed="1"/>
     <w:lsdException w:name="footer" w:semiHidden="1" w:unhideWhenUsed="1"/>
     <w:lsdException w:name="index heading" w:semiHidden="1" w:unhideWhenUsed="1"/>
-    <w:lsdException w:name="caption" w:semiHidden="1" w:uiPriority="35" w:unhideWhenUsed="1" w:qFormat="1"/>
+    <w:lsdException w:name="caption" w:uiPriority="35" w:semiHidden="1" w:unhideWhenUsed="1" w:qFormat="1"/>
     <w:lsdException w:name="table of figures" w:semiHidden="1" w:unhideWhenUsed="1"/>
     <w:lsdException w:name="envelope address" w:semiHidden="1" w:unhideWhenUsed="1"/>
     <w:lsdException w:name="envelope return" w:semiHidden="1" w:unhideWhenUsed="1"/>
@@ -2521,7 +2568,7 @@
     <w:lsdException w:name="Title" w:uiPriority="10" w:qFormat="1"/>
     <w:lsdException w:name="Closing" w:semiHidden="1" w:unhideWhenUsed="1"/>
     <w:lsdException w:name="Signature" w:semiHidden="1" w:unhideWhenUsed="1"/>
-    <w:lsdException w:name="Default Paragraph Font" w:semiHidden="1" w:uiPriority="1" w:unhideWhenUsed="1"/>
+    <w:lsdException w:name="Default Paragraph Font" w:uiPriority="1" w:semiHidden="1" w:unhideWhenUsed="1"/>
     <w:lsdException w:name="Body Text" w:semiHidden="1" w:unhideWhenUsed="1"/>
     <w:lsdException w:name="Body Text Indent" w:semiHidden="1" w:unhideWhenUsed="1"/>
     <w:lsdException w:name="List Continue" w:semiHidden="1" w:unhideWhenUsed="1"/>
@@ -2721,8 +2768,8 @@
     <w:lsdException w:name="Subtle Reference" w:uiPriority="31" w:qFormat="1"/>
     <w:lsdException w:name="Intense Reference" w:uiPriority="32" w:qFormat="1"/>
     <w:lsdException w:name="Book Title" w:uiPriority="33" w:qFormat="1"/>
-    <w:lsdException w:name="Bibliography" w:semiHidden="1" w:uiPriority="37" w:unhideWhenUsed="1"/>
-    <w:lsdException w:name="TOC Heading" w:semiHidden="1" w:uiPriority="39" w:unhideWhenUsed="1" w:qFormat="1"/>
+    <w:lsdException w:name="Bibliography" w:uiPriority="37" w:semiHidden="1" w:unhideWhenUsed="1"/>
+    <w:lsdException w:name="TOC Heading" w:uiPriority="39" w:semiHidden="1" w:unhideWhenUsed="1" w:qFormat="1"/>
     <w:lsdException w:name="Plain Table 1" w:uiPriority="41"/>
     <w:lsdException w:name="Plain Table 2" w:uiPriority="42"/>
     <w:lsdException w:name="Plain Table 3" w:uiPriority="43"/>
@@ -2833,7 +2880,7 @@
     <w:lsdException w:name="Unresolved Mention" w:semiHidden="1" w:unhideWhenUsed="1"/>
     <w:lsdException w:name="Smart Link" w:semiHidden="1" w:unhideWhenUsed="1"/>
   </w:latentStyles>
-  <w:style w:type="paragraph" w:default="1" w:styleId="Normal">
+  <w:style w:type="paragraph" w:styleId="Normal" w:default="1">
     <w:name w:val="Normal"/>
     <w:qFormat/>
   </w:style>
@@ -2935,13 +2982,13 @@
       <w:i/>
     </w:rPr>
   </w:style>
-  <w:style w:type="character" w:default="1" w:styleId="DefaultParagraphFont">
+  <w:style w:type="character" w:styleId="DefaultParagraphFont" w:default="1">
     <w:name w:val="Default Paragraph Font"/>
     <w:uiPriority w:val="1"/>
     <w:semiHidden/>
     <w:unhideWhenUsed/>
   </w:style>
-  <w:style w:type="table" w:default="1" w:styleId="TableNormal">
+  <w:style w:type="table" w:styleId="TableNormal" w:default="1">
     <w:name w:val="Normal Table"/>
     <w:uiPriority w:val="99"/>
     <w:semiHidden/>
@@ -2956,7 +3003,7 @@
       </w:tblCellMar>
     </w:tblPr>
   </w:style>
-  <w:style w:type="numbering" w:default="1" w:styleId="NoList">
+  <w:style w:type="numbering" w:styleId="NoList" w:default="1">
     <w:name w:val="No List"/>
     <w:uiPriority w:val="99"/>
     <w:semiHidden/>
@@ -2982,7 +3029,7 @@
     <w:qFormat/>
     <w:pPr>
       <w:pBdr>
-        <w:left w:val="single" w:sz="12" w:space="8" w:color="A0A0A0"/>
+        <w:left w:val="single" w:color="A0A0A0" w:sz="12" w:space="8"/>
       </w:pBdr>
       <w:ind w:left="720" w:right="720"/>
     </w:pPr>
@@ -2991,7 +3038,7 @@
       <w:color w:val="404040"/>
     </w:rPr>
   </w:style>
-  <w:style w:type="paragraph" w:customStyle="1" w:styleId="Code">
+  <w:style w:type="paragraph" w:styleId="Code" w:customStyle="1">
     <w:name w:val="Code"/>
     <w:basedOn w:val="Normal"/>
     <w:link w:val="CodeChar"/>
@@ -3001,15 +3048,15 @@
       <w:contextualSpacing/>
     </w:pPr>
     <w:rPr>
-      <w:rFonts w:ascii="Consolas" w:eastAsia="Consolas" w:hAnsi="Consolas" w:cs="Consolas"/>
+      <w:rFonts w:ascii="Consolas" w:hAnsi="Consolas" w:eastAsia="Consolas" w:cs="Consolas"/>
       <w:sz w:val="20"/>
     </w:rPr>
   </w:style>
-  <w:style w:type="character" w:customStyle="1" w:styleId="CodeChar">
+  <w:style w:type="character" w:styleId="CodeChar" w:customStyle="1">
     <w:name w:val="Code Char"/>
     <w:link w:val="Code"/>
     <w:rPr>
-      <w:rFonts w:ascii="Consolas" w:eastAsia="Consolas" w:hAnsi="Consolas" w:cs="Consolas"/>
+      <w:rFonts w:ascii="Consolas" w:hAnsi="Consolas" w:eastAsia="Consolas" w:cs="Consolas"/>
       <w:sz w:val="20"/>
       <w:shd w:val="clear" w:color="auto" w:fill="F5F5F5"/>
     </w:rPr>
@@ -3053,12 +3100,12 @@
     <w:basedOn w:val="TableNormal"/>
     <w:tblPr>
       <w:tblBorders>
-        <w:top w:val="single" w:sz="4" w:space="0" w:color="auto"/>
-        <w:left w:val="single" w:sz="4" w:space="0" w:color="auto"/>
-        <w:bottom w:val="single" w:sz="4" w:space="0" w:color="auto"/>
-        <w:right w:val="single" w:sz="4" w:space="0" w:color="auto"/>
-        <w:insideH w:val="single" w:sz="4" w:space="0" w:color="auto"/>
-        <w:insideV w:val="single" w:sz="4" w:space="0" w:color="auto"/>
+        <w:top w:val="single" w:color="auto" w:sz="4" w:space="0"/>
+        <w:left w:val="single" w:color="auto" w:sz="4" w:space="0"/>
+        <w:bottom w:val="single" w:color="auto" w:sz="4" w:space="0"/>
+        <w:right w:val="single" w:color="auto" w:sz="4" w:space="0"/>
+        <w:insideH w:val="single" w:color="auto" w:sz="4" w:space="0"/>
+        <w:insideV w:val="single" w:color="auto" w:sz="4" w:space="0"/>
       </w:tblBorders>
     </w:tblPr>
   </w:style>
@@ -3090,7 +3137,7 @@
 </file>
 
 <file path=word/theme/theme1.xml><?xml version="1.0" encoding="utf-8"?>
-<a:theme xmlns:a="http://schemas.openxmlformats.org/drawingml/2006/main" name="Office Theme">
+<a:theme xmlns:a="http://schemas.openxmlformats.org/drawingml/2006/main" xmlns:thm15="http://schemas.microsoft.com/office/thememl/2012/main" name="Office Theme">
   <a:themeElements>
     <a:clrScheme name="Office">
       <a:dk1>

</xml_diff>

<commit_message>
Accept hyphenated KPK province input
Updated the earthquake flow to match `Khyber-Pakhtunkhwa` (and lowercase form) instead of the space-separated variant, keeping `KPK` aliases intact. This aligns province matching with the expected naming format and ensures trapped-population estimation runs for that input. The scoring documentation `.docx` was also updated.
</commit_message>
<xml_diff>
--- a/Relief Supply Distribution System Scoring Documentation.docx
+++ b/Relief Supply Distribution System Scoring Documentation.docx
@@ -1,6 +1,6 @@
 
 <file path=word/document.xml><?xml version="1.0" encoding="utf-8"?>
-<w:document xmlns:wpc="http://schemas.microsoft.com/office/word/2010/wordprocessingCanvas" xmlns:cx="http://schemas.microsoft.com/office/drawing/2014/chartex" xmlns:cx1="http://schemas.microsoft.com/office/drawing/2015/9/8/chartex" xmlns:cx2="http://schemas.microsoft.com/office/drawing/2015/10/21/chartex" xmlns:cx3="http://schemas.microsoft.com/office/drawing/2016/5/9/chartex" xmlns:cx4="http://schemas.microsoft.com/office/drawing/2016/5/10/chartex" xmlns:cx5="http://schemas.microsoft.com/office/drawing/2016/5/11/chartex" xmlns:cx6="http://schemas.microsoft.com/office/drawing/2016/5/12/chartex" xmlns:cx7="http://schemas.microsoft.com/office/drawing/2016/5/13/chartex" xmlns:cx8="http://schemas.microsoft.com/office/drawing/2016/5/14/chartex" xmlns:mc="http://schemas.openxmlformats.org/markup-compatibility/2006" xmlns:aink="http://schemas.microsoft.com/office/drawing/2016/ink" xmlns:am3d="http://schemas.microsoft.com/office/drawing/2017/model3d" xmlns:o="urn:schemas-microsoft-com:office:office" xmlns:r="http://schemas.openxmlformats.org/officeDocument/2006/relationships" xmlns:m="http://schemas.openxmlformats.org/officeDocument/2006/math" xmlns:v="urn:schemas-microsoft-com:vml" xmlns:wp14="http://schemas.microsoft.com/office/word/2010/wordprocessingDrawing" xmlns:wp="http://schemas.openxmlformats.org/drawingml/2006/wordprocessingDrawing" xmlns:w10="urn:schemas-microsoft-com:office:word" xmlns:w="http://schemas.openxmlformats.org/wordprocessingml/2006/main" xmlns:w14="http://schemas.microsoft.com/office/word/2010/wordml" xmlns:w15="http://schemas.microsoft.com/office/word/2012/wordml" xmlns:w16cex="http://schemas.microsoft.com/office/word/2018/wordml/cex" xmlns:w16cid="http://schemas.microsoft.com/office/word/2016/wordml/cid" xmlns:w16="http://schemas.microsoft.com/office/word/2018/wordml" xmlns:w16sdtdh="http://schemas.microsoft.com/office/word/2020/wordml/sdtdatahash" xmlns:w16se="http://schemas.microsoft.com/office/word/2015/wordml/symex" xmlns:wpg="http://schemas.microsoft.com/office/word/2010/wordprocessingGroup" xmlns:wpi="http://schemas.microsoft.com/office/word/2010/wordprocessingInk" xmlns:wne="http://schemas.microsoft.com/office/word/2006/wordml" xmlns:wps="http://schemas.microsoft.com/office/word/2010/wordprocessingShape" mc:Ignorable="w14 w15 w16se w16cid w16 w16cex w16sdtdh wp14">
+<w:document xmlns:wpc="http://schemas.microsoft.com/office/word/2010/wordprocessingCanvas" xmlns:cx="http://schemas.microsoft.com/office/drawing/2014/chartex" xmlns:cx1="http://schemas.microsoft.com/office/drawing/2015/9/8/chartex" xmlns:cx2="http://schemas.microsoft.com/office/drawing/2015/10/21/chartex" xmlns:cx3="http://schemas.microsoft.com/office/drawing/2016/5/9/chartex" xmlns:cx4="http://schemas.microsoft.com/office/drawing/2016/5/10/chartex" xmlns:cx5="http://schemas.microsoft.com/office/drawing/2016/5/11/chartex" xmlns:cx6="http://schemas.microsoft.com/office/drawing/2016/5/12/chartex" xmlns:cx7="http://schemas.microsoft.com/office/drawing/2016/5/13/chartex" xmlns:cx8="http://schemas.microsoft.com/office/drawing/2016/5/14/chartex" xmlns:mc="http://schemas.openxmlformats.org/markup-compatibility/2006" xmlns:aink="http://schemas.microsoft.com/office/drawing/2016/ink" xmlns:am3d="http://schemas.microsoft.com/office/drawing/2017/model3d" xmlns:o="urn:schemas-microsoft-com:office:office" xmlns:r="http://schemas.openxmlformats.org/officeDocument/2006/relationships" xmlns:m="http://schemas.openxmlformats.org/officeDocument/2006/math" xmlns:v="urn:schemas-microsoft-com:vml" xmlns:wp14="http://schemas.microsoft.com/office/word/2010/wordprocessingDrawing" xmlns:wp="http://schemas.openxmlformats.org/drawingml/2006/wordprocessingDrawing" xmlns:w10="urn:schemas-microsoft-com:office:word" xmlns:w="http://schemas.openxmlformats.org/wordprocessingml/2006/main" xmlns:w14="http://schemas.microsoft.com/office/word/2010/wordml" xmlns:w15="http://schemas.microsoft.com/office/word/2012/wordml" xmlns:w16cex="http://schemas.microsoft.com/office/word/2018/wordml/cex" xmlns:w16cid="http://schemas.microsoft.com/office/word/2016/wordml/cid" xmlns:w16="http://schemas.microsoft.com/office/word/2018/wordml" xmlns:w16sdtdh="http://schemas.microsoft.com/office/word/2020/wordml/sdtdatahash" xmlns:w16se="http://schemas.microsoft.com/office/word/2015/wordml/symex" xmlns:wpg="http://schemas.microsoft.com/office/word/2010/wordprocessingGroup" xmlns:wpi="http://schemas.microsoft.com/office/word/2010/wordprocessingInk" xmlns:wne="http://schemas.microsoft.com/office/word/2006/wordml" xmlns:wps="http://schemas.microsoft.com/office/word/2010/wordprocessingShape" xmlns:a="http://schemas.openxmlformats.org/drawingml/2006/main" xmlns:pic="http://schemas.openxmlformats.org/drawingml/2006/picture" xmlns:a14="http://schemas.microsoft.com/office/drawing/2010/main" mc:Ignorable="w14 w15 w16se w16cid w16 w16cex w16sdtdh wp14">
   <w:body>
     <w:p>
       <w:pPr>
@@ -1512,20 +1512,431 @@
           <w:ilvl w:val="0"/>
           <w:numId w:val="7"/>
         </w:numPr>
-      </w:pPr>
-      <w:r>
+        <w:rPr/>
+      </w:pPr>
+      <w:r>
+        <w:rPr/>
         <w:t>At the end of an earthquake the summary shows requests served, requests deferred, and trucks and packs remaining.</w:t>
       </w:r>
     </w:p>
     <w:p>
       <w:pPr>
         <w:pStyle w:val="Heading2"/>
-      </w:pPr>
-      <w:r>
-        <w:lastRenderedPageBreak/>
-        <w:t>3. Rati</w:t>
-      </w:r>
-      <w:r>
+        <w:suppressLineNumbers w:val="0"/>
+        <w:bidi w:val="0"/>
+        <w:spacing w:before="280" w:beforeAutospacing="off" w:after="100" w:afterAutospacing="off" w:line="259" w:lineRule="auto"/>
+        <w:ind w:left="0" w:right="0"/>
+        <w:jc w:val="left"/>
+      </w:pPr>
+      <w:r>
+        <w:rPr/>
+        <w:t>3. Sample Tests</w:t>
+      </w:r>
+    </w:p>
+    <w:p>
+      <w:pPr>
+        <w:pStyle w:val="Normal"/>
+        <w:bidi w:val="0"/>
+      </w:pPr>
+      <w:r>
+        <w:rPr/>
+        <w:t xml:space="preserve">The following sample tests were performed to test the program's </w:t>
+      </w:r>
+      <w:r>
+        <w:rPr>
+          <w:rFonts w:ascii="Calibri" w:hAnsi="Calibri" w:eastAsia="Calibri" w:cs="Calibri"/>
+          <w:noProof w:val="0"/>
+          <w:sz w:val="22"/>
+          <w:szCs w:val="22"/>
+          <w:lang w:val="en-US"/>
+        </w:rPr>
+        <w:t xml:space="preserve">processing of the requests and </w:t>
+      </w:r>
+      <w:r>
+        <w:rPr>
+          <w:rFonts w:ascii="Calibri" w:hAnsi="Calibri" w:eastAsia="Calibri" w:cs="Calibri"/>
+          <w:noProof w:val="0"/>
+          <w:sz w:val="22"/>
+          <w:szCs w:val="22"/>
+          <w:lang w:val="en-US"/>
+        </w:rPr>
+        <w:t>it's</w:t>
+      </w:r>
+      <w:r>
+        <w:rPr>
+          <w:rFonts w:ascii="Calibri" w:hAnsi="Calibri" w:eastAsia="Calibri" w:cs="Calibri"/>
+          <w:noProof w:val="0"/>
+          <w:sz w:val="22"/>
+          <w:szCs w:val="22"/>
+          <w:lang w:val="en-US"/>
+        </w:rPr>
+        <w:t xml:space="preserve"> behavior when trucks and/or supply packs run out.</w:t>
+      </w:r>
+    </w:p>
+    <w:p>
+      <w:pPr>
+        <w:pStyle w:val="Heading3"/>
+      </w:pPr>
+      <w:r>
+        <w:rPr/>
+        <w:t xml:space="preserve">3.1 </w:t>
+      </w:r>
+      <w:r>
+        <w:rPr/>
+        <w:t>R1 – Riverside Village (Sufficient Resources)</w:t>
+      </w:r>
+    </w:p>
+    <w:p>
+      <w:pPr>
+        <w:pStyle w:val="Normal"/>
+      </w:pPr>
+      <w:r>
+        <w:drawing>
+          <wp:inline wp14:editId="6EC0F2C9" wp14:anchorId="19C4079C">
+            <wp:extent cx="5188216" cy="4172165"/>
+            <wp:effectExtent l="0" t="0" r="0" b="0"/>
+            <wp:docPr id="966454875" name="drawing"/>
+            <wp:cNvGraphicFramePr>
+              <a:graphicFrameLocks noChangeAspect="1"/>
+            </wp:cNvGraphicFramePr>
+            <a:graphic>
+              <a:graphicData xmlns:a="http://schemas.openxmlformats.org/drawingml/2006/main" uri="http://schemas.openxmlformats.org/drawingml/2006/picture">
+                <pic:pic xmlns:pic="http://schemas.openxmlformats.org/drawingml/2006/picture">
+                  <pic:nvPicPr>
+                    <pic:cNvPr id="966454875" name="Picture 966454875"/>
+                    <pic:cNvPicPr/>
+                  </pic:nvPicPr>
+                  <pic:blipFill>
+                    <a:blip xmlns:r="http://schemas.openxmlformats.org/officeDocument/2006/relationships" r:embed="rId590013154">
+                      <a:extLst>
+                        <a:ext uri="{28A0092B-C50C-407E-A947-70E740481C1C}">
+                          <a14:useLocalDpi xmlns:a14="http://schemas.microsoft.com/office/drawing/2010/main"/>
+                        </a:ext>
+                      </a:extLst>
+                    </a:blip>
+                    <a:stretch>
+                      <a:fillRect/>
+                    </a:stretch>
+                  </pic:blipFill>
+                  <pic:spPr>
+                    <a:xfrm>
+                      <a:off x="0" y="0"/>
+                      <a:ext cx="5188216" cy="4172165"/>
+                    </a:xfrm>
+                    <a:prstGeom prst="rect">
+                      <a:avLst/>
+                    </a:prstGeom>
+                  </pic:spPr>
+                </pic:pic>
+              </a:graphicData>
+            </a:graphic>
+          </wp:inline>
+        </w:drawing>
+      </w:r>
+    </w:p>
+    <w:p>
+      <w:pPr>
+        <w:pStyle w:val="Heading3"/>
+      </w:pPr>
+      <w:r>
+        <w:rPr/>
+        <w:t>3.2 R2 – Hilltop Settlement (Sufficient Resources)</w:t>
+      </w:r>
+    </w:p>
+    <w:p>
+      <w:pPr>
+        <w:pStyle w:val="Normal"/>
+      </w:pPr>
+      <w:r>
+        <w:drawing>
+          <wp:inline wp14:editId="2C960F46" wp14:anchorId="6E015CC0">
+            <wp:extent cx="5277121" cy="4159464"/>
+            <wp:effectExtent l="0" t="0" r="0" b="0"/>
+            <wp:docPr id="521575906" name="drawing"/>
+            <wp:cNvGraphicFramePr>
+              <a:graphicFrameLocks noChangeAspect="1"/>
+            </wp:cNvGraphicFramePr>
+            <a:graphic>
+              <a:graphicData xmlns:a="http://schemas.openxmlformats.org/drawingml/2006/main" uri="http://schemas.openxmlformats.org/drawingml/2006/picture">
+                <pic:pic xmlns:pic="http://schemas.openxmlformats.org/drawingml/2006/picture">
+                  <pic:nvPicPr>
+                    <pic:cNvPr id="521575906" name="Picture 521575906"/>
+                    <pic:cNvPicPr/>
+                  </pic:nvPicPr>
+                  <pic:blipFill>
+                    <a:blip xmlns:r="http://schemas.openxmlformats.org/officeDocument/2006/relationships" r:embed="rId2014842373">
+                      <a:extLst>
+                        <a:ext uri="{28A0092B-C50C-407E-A947-70E740481C1C}">
+                          <a14:useLocalDpi xmlns:a14="http://schemas.microsoft.com/office/drawing/2010/main"/>
+                        </a:ext>
+                      </a:extLst>
+                    </a:blip>
+                    <a:stretch>
+                      <a:fillRect/>
+                    </a:stretch>
+                  </pic:blipFill>
+                  <pic:spPr>
+                    <a:xfrm>
+                      <a:off x="0" y="0"/>
+                      <a:ext cx="5277121" cy="4159464"/>
+                    </a:xfrm>
+                    <a:prstGeom prst="rect">
+                      <a:avLst/>
+                    </a:prstGeom>
+                  </pic:spPr>
+                </pic:pic>
+              </a:graphicData>
+            </a:graphic>
+          </wp:inline>
+        </w:drawing>
+      </w:r>
+    </w:p>
+    <w:p>
+      <w:pPr>
+        <w:pStyle w:val="Heading3"/>
+        <w:suppressLineNumbers w:val="0"/>
+        <w:bidi w:val="0"/>
+        <w:spacing w:before="240" w:beforeAutospacing="off" w:after="80" w:afterAutospacing="off" w:line="259" w:lineRule="auto"/>
+        <w:ind w:left="0" w:right="0"/>
+        <w:jc w:val="left"/>
+      </w:pPr>
+      <w:r>
+        <w:rPr/>
+        <w:t>3.</w:t>
+      </w:r>
+      <w:r>
+        <w:rPr/>
+        <w:t>3</w:t>
+      </w:r>
+      <w:r>
+        <w:rPr/>
+        <w:t xml:space="preserve"> R</w:t>
+      </w:r>
+      <w:r>
+        <w:rPr/>
+        <w:t>3</w:t>
+      </w:r>
+      <w:r>
+        <w:rPr/>
+        <w:t xml:space="preserve"> – </w:t>
+      </w:r>
+      <w:r>
+        <w:rPr/>
+        <w:t>Lakeside Camp</w:t>
+      </w:r>
+      <w:r>
+        <w:rPr/>
+        <w:t xml:space="preserve"> (Sufficient Resources)</w:t>
+      </w:r>
+    </w:p>
+    <w:p>
+      <w:pPr>
+        <w:pStyle w:val="Normal"/>
+      </w:pPr>
+      <w:r>
+        <w:drawing>
+          <wp:inline wp14:editId="5FA53458" wp14:anchorId="182C2006">
+            <wp:extent cx="5112013" cy="4102311"/>
+            <wp:effectExtent l="0" t="0" r="0" b="0"/>
+            <wp:docPr id="2120089011" name="drawing"/>
+            <wp:cNvGraphicFramePr>
+              <a:graphicFrameLocks noChangeAspect="1"/>
+            </wp:cNvGraphicFramePr>
+            <a:graphic>
+              <a:graphicData xmlns:a="http://schemas.openxmlformats.org/drawingml/2006/main" uri="http://schemas.openxmlformats.org/drawingml/2006/picture">
+                <pic:pic xmlns:pic="http://schemas.openxmlformats.org/drawingml/2006/picture">
+                  <pic:nvPicPr>
+                    <pic:cNvPr id="2120089011" name="Picture 2120089011"/>
+                    <pic:cNvPicPr/>
+                  </pic:nvPicPr>
+                  <pic:blipFill>
+                    <a:blip xmlns:r="http://schemas.openxmlformats.org/officeDocument/2006/relationships" r:embed="rId128292894">
+                      <a:extLst>
+                        <a:ext uri="{28A0092B-C50C-407E-A947-70E740481C1C}">
+                          <a14:useLocalDpi xmlns:a14="http://schemas.microsoft.com/office/drawing/2010/main"/>
+                        </a:ext>
+                      </a:extLst>
+                    </a:blip>
+                    <a:stretch>
+                      <a:fillRect/>
+                    </a:stretch>
+                  </pic:blipFill>
+                  <pic:spPr>
+                    <a:xfrm>
+                      <a:off x="0" y="0"/>
+                      <a:ext cx="5112013" cy="4102311"/>
+                    </a:xfrm>
+                    <a:prstGeom prst="rect">
+                      <a:avLst/>
+                    </a:prstGeom>
+                  </pic:spPr>
+                </pic:pic>
+              </a:graphicData>
+            </a:graphic>
+          </wp:inline>
+        </w:drawing>
+      </w:r>
+    </w:p>
+    <w:p>
+      <w:pPr>
+        <w:pStyle w:val="Heading3"/>
+        <w:keepNext w:val="1"/>
+        <w:suppressLineNumbers w:val="0"/>
+        <w:bidi w:val="0"/>
+        <w:spacing w:before="240" w:beforeAutospacing="off" w:after="80" w:afterAutospacing="off" w:line="259" w:lineRule="auto"/>
+        <w:ind w:left="0" w:right="0"/>
+        <w:jc w:val="left"/>
+      </w:pPr>
+      <w:r>
+        <w:rPr>
+          <w:rFonts w:ascii="Calibri" w:hAnsi="Calibri" w:eastAsia="Calibri" w:cs="Calibri"/>
+          <w:b w:val="1"/>
+          <w:bCs w:val="1"/>
+          <w:i w:val="0"/>
+          <w:iCs w:val="0"/>
+          <w:caps w:val="0"/>
+          <w:smallCaps w:val="0"/>
+          <w:noProof w:val="0"/>
+          <w:color w:val="000000" w:themeColor="text1" w:themeTint="FF" w:themeShade="FF"/>
+          <w:sz w:val="24"/>
+          <w:szCs w:val="24"/>
+          <w:lang w:val="en-US"/>
+        </w:rPr>
+        <w:t>3.4 R2 – Market Town (Insufficient Resources)</w:t>
+      </w:r>
+    </w:p>
+    <w:p>
+      <w:pPr>
+        <w:pStyle w:val="Normal"/>
+        <w:keepNext w:val="1"/>
+        <w:bidi w:val="0"/>
+      </w:pPr>
+      <w:r>
+        <w:drawing>
+          <wp:inline wp14:editId="1ACD2C57" wp14:anchorId="207345FC">
+            <wp:extent cx="4629388" cy="4210267"/>
+            <wp:effectExtent l="0" t="0" r="0" b="0"/>
+            <wp:docPr id="2130068532" name="drawing"/>
+            <wp:cNvGraphicFramePr>
+              <a:graphicFrameLocks noChangeAspect="1"/>
+            </wp:cNvGraphicFramePr>
+            <a:graphic>
+              <a:graphicData xmlns:a="http://schemas.openxmlformats.org/drawingml/2006/main" uri="http://schemas.openxmlformats.org/drawingml/2006/picture">
+                <pic:pic xmlns:pic="http://schemas.openxmlformats.org/drawingml/2006/picture">
+                  <pic:nvPicPr>
+                    <pic:cNvPr id="2130068532" name="Picture 2130068532"/>
+                    <pic:cNvPicPr/>
+                  </pic:nvPicPr>
+                  <pic:blipFill>
+                    <a:blip xmlns:r="http://schemas.openxmlformats.org/officeDocument/2006/relationships" r:embed="rId2040088011">
+                      <a:extLst>
+                        <a:ext uri="{28A0092B-C50C-407E-A947-70E740481C1C}">
+                          <a14:useLocalDpi xmlns:a14="http://schemas.microsoft.com/office/drawing/2010/main"/>
+                        </a:ext>
+                      </a:extLst>
+                    </a:blip>
+                    <a:stretch>
+                      <a:fillRect/>
+                    </a:stretch>
+                  </pic:blipFill>
+                  <pic:spPr>
+                    <a:xfrm>
+                      <a:off x="0" y="0"/>
+                      <a:ext cx="4629388" cy="4210267"/>
+                    </a:xfrm>
+                    <a:prstGeom prst="rect">
+                      <a:avLst/>
+                    </a:prstGeom>
+                  </pic:spPr>
+                </pic:pic>
+              </a:graphicData>
+            </a:graphic>
+          </wp:inline>
+        </w:drawing>
+      </w:r>
+    </w:p>
+    <w:p>
+      <w:pPr>
+        <w:pStyle w:val="Heading3"/>
+        <w:keepNext w:val="1"/>
+        <w:suppressLineNumbers w:val="0"/>
+        <w:bidi w:val="0"/>
+        <w:spacing w:before="240" w:beforeAutospacing="off" w:after="80" w:afterAutospacing="off" w:line="259" w:lineRule="auto"/>
+        <w:ind w:left="0" w:right="0"/>
+        <w:jc w:val="left"/>
+      </w:pPr>
+      <w:r>
+        <w:rPr>
+          <w:rFonts w:ascii="Calibri" w:hAnsi="Calibri" w:eastAsia="Calibri" w:cs="Calibri"/>
+          <w:b w:val="1"/>
+          <w:bCs w:val="1"/>
+          <w:i w:val="0"/>
+          <w:iCs w:val="0"/>
+          <w:caps w:val="0"/>
+          <w:smallCaps w:val="0"/>
+          <w:noProof w:val="0"/>
+          <w:color w:val="000000" w:themeColor="text1" w:themeTint="FF" w:themeShade="FF"/>
+          <w:sz w:val="24"/>
+          <w:szCs w:val="24"/>
+          <w:lang w:val="en-US"/>
+        </w:rPr>
+        <w:t>3.5 R5</w:t>
+      </w:r>
+      <w:r>
+        <w:rPr>
+          <w:noProof w:val="0"/>
+          <w:lang w:val="en-US"/>
+        </w:rPr>
+        <w:t xml:space="preserve"> Bridge Colony</w:t>
+      </w:r>
+      <w:r>
+        <w:rPr>
+          <w:rFonts w:ascii="Calibri" w:hAnsi="Calibri" w:eastAsia="Calibri" w:cs="Calibri"/>
+          <w:b w:val="1"/>
+          <w:bCs w:val="1"/>
+          <w:i w:val="0"/>
+          <w:iCs w:val="0"/>
+          <w:caps w:val="0"/>
+          <w:smallCaps w:val="0"/>
+          <w:noProof w:val="0"/>
+          <w:color w:val="000000" w:themeColor="text1" w:themeTint="FF" w:themeShade="FF"/>
+          <w:sz w:val="24"/>
+          <w:szCs w:val="24"/>
+          <w:lang w:val="en-US"/>
+        </w:rPr>
+        <w:t xml:space="preserve"> – Market Town (Insufficient Resources)</w:t>
+      </w:r>
+    </w:p>
+    <w:p>
+      <w:pPr>
+        <w:pStyle w:val="Normal"/>
+        <w:keepNext w:val="1"/>
+        <w:bidi w:val="0"/>
+        <w:rPr>
+          <w:noProof w:val="0"/>
+          <w:lang w:val="en-US"/>
+        </w:rPr>
+      </w:pPr>
+    </w:p>
+    <w:p>
+      <w:pPr>
+        <w:pStyle w:val="Normal"/>
+      </w:pPr>
+    </w:p>
+    <w:p>
+      <w:pPr>
+        <w:pStyle w:val="Heading2"/>
+      </w:pPr>
+      <w:r>
+        <w:rPr/>
+        <w:t>4</w:t>
+      </w:r>
+      <w:r>
+        <w:rPr/>
+        <w:t>. Rati</w:t>
+      </w:r>
+      <w:r>
+        <w:rPr/>
         <w:t>onale</w:t>
       </w:r>
     </w:p>
@@ -1542,7 +1953,12 @@
         <w:pStyle w:val="Heading3"/>
       </w:pPr>
       <w:r>
-        <w:t>3.1 Design principles</w:t>
+        <w:rPr/>
+        <w:t>4</w:t>
+      </w:r>
+      <w:r>
+        <w:rPr/>
+        <w:t>.1 Design principles</w:t>
       </w:r>
     </w:p>
     <w:p>
@@ -1639,7 +2055,12 @@
         <w:pStyle w:val="Heading3"/>
       </w:pPr>
       <w:r>
-        <w:t>3.2 Reason for every input weight</w:t>
+        <w:rPr/>
+        <w:t>4</w:t>
+      </w:r>
+      <w:r>
+        <w:rPr/>
+        <w:t>.2 Reason for every input weight</w:t>
       </w:r>
     </w:p>
     <w:p>
@@ -1824,9 +2245,15 @@
         <w:pStyle w:val="Heading3"/>
       </w:pPr>
       <w:r>
-        <w:t>3.3 Reason for the package th</w:t>
-      </w:r>
-      <w:r>
+        <w:rPr/>
+        <w:t>4</w:t>
+      </w:r>
+      <w:r>
+        <w:rPr/>
+        <w:t>.3 Reason for the package th</w:t>
+      </w:r>
+      <w:r>
+        <w:rPr/>
         <w:t>resholds</w:t>
       </w:r>
     </w:p>
@@ -1886,9 +2313,15 @@
         <w:pStyle w:val="Heading3"/>
       </w:pPr>
       <w:r>
-        <w:t>3.4 Reason for the fallback to a small</w:t>
-      </w:r>
-      <w:r>
+        <w:rPr/>
+        <w:t>4</w:t>
+      </w:r>
+      <w:r>
+        <w:rPr/>
+        <w:t>.4 Reason for the fallback to a small</w:t>
+      </w:r>
+      <w:r>
+        <w:rPr/>
         <w:t>er package</w:t>
       </w:r>
     </w:p>
@@ -1975,8 +2408,12 @@
         <w:pStyle w:val="Heading2"/>
       </w:pPr>
       <w:r>
-        <w:lastRenderedPageBreak/>
-        <w:t>4. Results</w:t>
+        <w:rPr/>
+        <w:t>5</w:t>
+      </w:r>
+      <w:r>
+        <w:rPr/>
+        <w:t>. Results</w:t>
       </w:r>
     </w:p>
     <w:p>
@@ -1984,7 +2421,12 @@
         <w:pStyle w:val="Heading3"/>
       </w:pPr>
       <w:r>
-        <w:t>4.1 Capacity of the default stock</w:t>
+        <w:rPr/>
+        <w:t>5</w:t>
+      </w:r>
+      <w:r>
+        <w:rPr/>
+        <w:t>.1 Capacity of the default stock</w:t>
       </w:r>
     </w:p>
     <w:tbl>
@@ -2186,14 +2628,19 @@
         <w:pStyle w:val="Heading3"/>
       </w:pPr>
       <w:r>
-        <w:t xml:space="preserve">4.2 Verified </w:t>
-      </w:r>
-      <w:proofErr w:type="spellStart"/>
-      <w:r>
-        <w:t>behaviours</w:t>
-      </w:r>
-      <w:proofErr w:type="spellEnd"/>
-      <w:r>
+        <w:rPr/>
+        <w:t>5</w:t>
+      </w:r>
+      <w:r>
+        <w:rPr/>
+        <w:t xml:space="preserve">.2 Verified </w:t>
+      </w:r>
+      <w:r>
+        <w:rPr/>
+        <w:t>behaviors</w:t>
+      </w:r>
+      <w:r>
+        <w:rPr/>
         <w:t xml:space="preserve"> of the scoring model</w:t>
       </w:r>
     </w:p>

</xml_diff>

<commit_message>
Add test screenshots and update scoring doc
Updated the Relief Supply Distribution System scoring documentation and added five test evidence images under `Tests/` (`Test1.png` through `Test5.png`) to document and support evaluation results.
</commit_message>
<xml_diff>
--- a/Relief Supply Distribution System Scoring Documentation.docx
+++ b/Relief Supply Distribution System Scoring Documentation.docx
@@ -1592,7 +1592,7 @@
       </w:pPr>
       <w:r>
         <w:drawing>
-          <wp:inline wp14:editId="6EC0F2C9" wp14:anchorId="19C4079C">
+          <wp:inline wp14:editId="5009D56C" wp14:anchorId="19C4079C">
             <wp:extent cx="5188216" cy="4172165"/>
             <wp:effectExtent l="0" t="0" r="0" b="0"/>
             <wp:docPr id="966454875" name="drawing"/>
@@ -1649,7 +1649,7 @@
       </w:pPr>
       <w:r>
         <w:drawing>
-          <wp:inline wp14:editId="2C960F46" wp14:anchorId="6E015CC0">
+          <wp:inline wp14:editId="77E122BA" wp14:anchorId="6E015CC0">
             <wp:extent cx="5277121" cy="4159464"/>
             <wp:effectExtent l="0" t="0" r="0" b="0"/>
             <wp:docPr id="521575906" name="drawing"/>
@@ -1735,7 +1735,7 @@
       </w:pPr>
       <w:r>
         <w:drawing>
-          <wp:inline wp14:editId="5FA53458" wp14:anchorId="182C2006">
+          <wp:inline wp14:editId="5FB84B9E" wp14:anchorId="182C2006">
             <wp:extent cx="5112013" cy="4102311"/>
             <wp:effectExtent l="0" t="0" r="0" b="0"/>
             <wp:docPr id="2120089011" name="drawing"/>
@@ -1813,10 +1813,10 @@
       </w:pPr>
       <w:r>
         <w:drawing>
-          <wp:inline wp14:editId="1ACD2C57" wp14:anchorId="207345FC">
-            <wp:extent cx="4629388" cy="4210267"/>
+          <wp:inline wp14:editId="125E537C" wp14:anchorId="48B2C71C">
+            <wp:extent cx="3952875" cy="5943600"/>
             <wp:effectExtent l="0" t="0" r="0" b="0"/>
-            <wp:docPr id="2130068532" name="drawing"/>
+            <wp:docPr id="501064666" name="drawing"/>
             <wp:cNvGraphicFramePr>
               <a:graphicFrameLocks noChangeAspect="1"/>
             </wp:cNvGraphicFramePr>
@@ -1824,11 +1824,11 @@
               <a:graphicData xmlns:a="http://schemas.openxmlformats.org/drawingml/2006/main" uri="http://schemas.openxmlformats.org/drawingml/2006/picture">
                 <pic:pic xmlns:pic="http://schemas.openxmlformats.org/drawingml/2006/picture">
                   <pic:nvPicPr>
-                    <pic:cNvPr id="2130068532" name="Picture 2130068532"/>
+                    <pic:cNvPr id="501064666" name="Picture 501064666"/>
                     <pic:cNvPicPr/>
                   </pic:nvPicPr>
                   <pic:blipFill>
-                    <a:blip xmlns:r="http://schemas.openxmlformats.org/officeDocument/2006/relationships" r:embed="rId2040088011">
+                    <a:blip xmlns:r="http://schemas.openxmlformats.org/officeDocument/2006/relationships" r:embed="rId1224603510">
                       <a:extLst>
                         <a:ext uri="{28A0092B-C50C-407E-A947-70E740481C1C}">
                           <a14:useLocalDpi xmlns:a14="http://schemas.microsoft.com/office/drawing/2010/main"/>
@@ -1842,7 +1842,7 @@
                   <pic:spPr>
                     <a:xfrm>
                       <a:off x="0" y="0"/>
-                      <a:ext cx="4629388" cy="4210267"/>
+                      <a:ext cx="3952875" cy="5943600"/>
                     </a:xfrm>
                     <a:prstGeom prst="rect">
                       <a:avLst/>
@@ -1853,6 +1853,36 @@
             </a:graphic>
           </wp:inline>
         </w:drawing>
+      </w:r>
+    </w:p>
+    <w:p>
+      <w:pPr>
+        <w:pStyle w:val="Heading3"/>
+        <w:keepNext w:val="1"/>
+        <w:suppressLineNumbers w:val="0"/>
+        <w:bidi w:val="0"/>
+        <w:spacing w:before="240" w:beforeAutospacing="off" w:after="80" w:afterAutospacing="off" w:line="259" w:lineRule="auto"/>
+        <w:ind w:left="0" w:right="0"/>
+        <w:jc w:val="left"/>
+        <w:rPr>
+          <w:rFonts w:ascii="Calibri" w:hAnsi="Calibri" w:eastAsia="Calibri" w:cs="Calibri"/>
+          <w:b w:val="1"/>
+          <w:bCs w:val="1"/>
+          <w:i w:val="0"/>
+          <w:iCs w:val="0"/>
+          <w:caps w:val="0"/>
+          <w:smallCaps w:val="0"/>
+          <w:noProof w:val="0"/>
+          <w:color w:val="000000" w:themeColor="text1" w:themeTint="FF" w:themeShade="FF"/>
+          <w:sz w:val="24"/>
+          <w:szCs w:val="24"/>
+          <w:lang w:val="en-US"/>
+        </w:rPr>
+      </w:pPr>
+    </w:p>
+    <w:p>
+      <w:r>
+        <w:br w:type="page"/>
       </w:r>
     </w:p>
     <w:p>
@@ -1906,59 +1936,111 @@
         </w:rPr>
         <w:t xml:space="preserve"> – Market Town (Insufficient Resources)</w:t>
       </w:r>
+      <w:r>
+        <w:drawing>
+          <wp:inline wp14:editId="343862AA" wp14:anchorId="1855D4F3">
+            <wp:extent cx="3990975" cy="5943600"/>
+            <wp:effectExtent l="0" t="0" r="0" b="0"/>
+            <wp:docPr id="1143461720" name="drawing"/>
+            <wp:cNvGraphicFramePr>
+              <a:graphicFrameLocks noChangeAspect="1"/>
+            </wp:cNvGraphicFramePr>
+            <a:graphic>
+              <a:graphicData xmlns:a="http://schemas.openxmlformats.org/drawingml/2006/main" uri="http://schemas.openxmlformats.org/drawingml/2006/picture">
+                <pic:pic xmlns:pic="http://schemas.openxmlformats.org/drawingml/2006/picture">
+                  <pic:nvPicPr>
+                    <pic:cNvPr id="1143461720" name="Picture 1143461720"/>
+                    <pic:cNvPicPr/>
+                  </pic:nvPicPr>
+                  <pic:blipFill>
+                    <a:blip xmlns:r="http://schemas.openxmlformats.org/officeDocument/2006/relationships" r:embed="rId1261434731">
+                      <a:extLst>
+                        <a:ext uri="{28A0092B-C50C-407E-A947-70E740481C1C}">
+                          <a14:useLocalDpi xmlns:a14="http://schemas.microsoft.com/office/drawing/2010/main"/>
+                        </a:ext>
+                      </a:extLst>
+                    </a:blip>
+                    <a:stretch>
+                      <a:fillRect/>
+                    </a:stretch>
+                  </pic:blipFill>
+                  <pic:spPr>
+                    <a:xfrm>
+                      <a:off x="0" y="0"/>
+                      <a:ext cx="3990975" cy="5943600"/>
+                    </a:xfrm>
+                    <a:prstGeom prst="rect">
+                      <a:avLst/>
+                    </a:prstGeom>
+                  </pic:spPr>
+                </pic:pic>
+              </a:graphicData>
+            </a:graphic>
+          </wp:inline>
+        </w:drawing>
+      </w:r>
     </w:p>
     <w:p>
       <w:pPr>
         <w:pStyle w:val="Normal"/>
-        <w:keepNext w:val="1"/>
-        <w:bidi w:val="0"/>
+      </w:pPr>
+    </w:p>
+    <w:p>
+      <w:pPr>
+        <w:pStyle w:val="Heading2"/>
+      </w:pPr>
+      <w:r>
+        <w:rPr/>
+        <w:t>4</w:t>
+      </w:r>
+      <w:r>
+        <w:rPr/>
+        <w:t>. Rati</w:t>
+      </w:r>
+      <w:r>
+        <w:rPr/>
+        <w:t>onale</w:t>
+      </w:r>
+    </w:p>
+    <w:p>
+      <w:r>
+        <w:t xml:space="preserve">The point values are design judgements by the project team. They are not statistically calibrated against historical disaster data. The reasons below justify why each input is in the model, its rank against the other inputs, and its size relative to </w:t>
+      </w:r>
+      <w:r>
+        <w:t>the package thresholds.</w:t>
+      </w:r>
+    </w:p>
+    <w:p>
+      <w:pPr>
+        <w:pStyle w:val="Heading3"/>
+      </w:pPr>
+      <w:r>
+        <w:rPr/>
+        <w:t>4</w:t>
+      </w:r>
+      <w:r>
         <w:rPr>
-          <w:noProof w:val="0"/>
-          <w:lang w:val="en-US"/>
+          <w:rFonts w:ascii="Calibri" w:hAnsi="Calibri" w:eastAsia="Calibri" w:cs="Calibri"/>
+          <w:b w:val="1"/>
+          <w:bCs w:val="1"/>
+          <w:color w:val="auto"/>
+          <w:sz w:val="24"/>
+          <w:szCs w:val="24"/>
+          <w:lang w:eastAsia="en-US" w:bidi="ar-SA"/>
         </w:rPr>
-      </w:pPr>
-    </w:p>
-    <w:p>
-      <w:pPr>
-        <w:pStyle w:val="Normal"/>
-      </w:pPr>
-    </w:p>
-    <w:p>
-      <w:pPr>
-        <w:pStyle w:val="Heading2"/>
-      </w:pPr>
-      <w:r>
-        <w:rPr/>
-        <w:t>4</w:t>
-      </w:r>
-      <w:r>
-        <w:rPr/>
-        <w:t>. Rati</w:t>
-      </w:r>
-      <w:r>
-        <w:rPr/>
-        <w:t>onale</w:t>
-      </w:r>
-    </w:p>
-    <w:p>
-      <w:r>
-        <w:t xml:space="preserve">The point values are design judgements by the project team. They are not statistically calibrated against historical disaster data. The reasons below justify why each input is in the model, its rank against the other inputs, and its size relative to </w:t>
-      </w:r>
-      <w:r>
-        <w:t>the package thresholds.</w:t>
-      </w:r>
-    </w:p>
-    <w:p>
-      <w:pPr>
-        <w:pStyle w:val="Heading3"/>
-      </w:pPr>
-      <w:r>
-        <w:rPr/>
-        <w:t>4</w:t>
-      </w:r>
-      <w:r>
-        <w:rPr/>
-        <w:t>.1 Design principles</w:t>
+        <w:t>.1</w:t>
+      </w:r>
+      <w:r>
+        <w:rPr>
+          <w:rFonts w:ascii="Calibri" w:hAnsi="Calibri" w:eastAsia="Calibri" w:cs="Calibri"/>
+          <w:b w:val="1"/>
+          <w:bCs w:val="1"/>
+          <w:color w:val="auto"/>
+          <w:sz w:val="24"/>
+          <w:szCs w:val="24"/>
+          <w:lang w:eastAsia="en-US" w:bidi="ar-SA"/>
+        </w:rPr>
+        <w:t xml:space="preserve"> Design principles</w:t>
       </w:r>
     </w:p>
     <w:p>

</xml_diff>

<commit_message>
Update relief scoring documentation
Refresh the scoring documentation with a repository link, clearer formatting, expanded sample test scenarios, and reorganized rationale/results sections. This also updates the matching Word document version to reflect the revised README content.
</commit_message>
<xml_diff>
--- a/Relief Supply Distribution System Scoring Documentation.docx
+++ b/Relief Supply Distribution System Scoring Documentation.docx
@@ -1,28 +1,22 @@
 
 <file path=word/document.xml><?xml version="1.0" encoding="utf-8"?>
-<w:document xmlns:wpc="http://schemas.microsoft.com/office/word/2010/wordprocessingCanvas" xmlns:cx="http://schemas.microsoft.com/office/drawing/2014/chartex" xmlns:cx1="http://schemas.microsoft.com/office/drawing/2015/9/8/chartex" xmlns:cx2="http://schemas.microsoft.com/office/drawing/2015/10/21/chartex" xmlns:cx3="http://schemas.microsoft.com/office/drawing/2016/5/9/chartex" xmlns:cx4="http://schemas.microsoft.com/office/drawing/2016/5/10/chartex" xmlns:cx5="http://schemas.microsoft.com/office/drawing/2016/5/11/chartex" xmlns:cx6="http://schemas.microsoft.com/office/drawing/2016/5/12/chartex" xmlns:cx7="http://schemas.microsoft.com/office/drawing/2016/5/13/chartex" xmlns:cx8="http://schemas.microsoft.com/office/drawing/2016/5/14/chartex" xmlns:mc="http://schemas.openxmlformats.org/markup-compatibility/2006" xmlns:aink="http://schemas.microsoft.com/office/drawing/2016/ink" xmlns:am3d="http://schemas.microsoft.com/office/drawing/2017/model3d" xmlns:o="urn:schemas-microsoft-com:office:office" xmlns:r="http://schemas.openxmlformats.org/officeDocument/2006/relationships" xmlns:m="http://schemas.openxmlformats.org/officeDocument/2006/math" xmlns:v="urn:schemas-microsoft-com:vml" xmlns:wp14="http://schemas.microsoft.com/office/word/2010/wordprocessingDrawing" xmlns:wp="http://schemas.openxmlformats.org/drawingml/2006/wordprocessingDrawing" xmlns:w10="urn:schemas-microsoft-com:office:word" xmlns:w="http://schemas.openxmlformats.org/wordprocessingml/2006/main" xmlns:w14="http://schemas.microsoft.com/office/word/2010/wordml" xmlns:w15="http://schemas.microsoft.com/office/word/2012/wordml" xmlns:w16cex="http://schemas.microsoft.com/office/word/2018/wordml/cex" xmlns:w16cid="http://schemas.microsoft.com/office/word/2016/wordml/cid" xmlns:w16="http://schemas.microsoft.com/office/word/2018/wordml" xmlns:w16sdtdh="http://schemas.microsoft.com/office/word/2020/wordml/sdtdatahash" xmlns:w16se="http://schemas.microsoft.com/office/word/2015/wordml/symex" xmlns:wpg="http://schemas.microsoft.com/office/word/2010/wordprocessingGroup" xmlns:wpi="http://schemas.microsoft.com/office/word/2010/wordprocessingInk" xmlns:wne="http://schemas.microsoft.com/office/word/2006/wordml" xmlns:wps="http://schemas.microsoft.com/office/word/2010/wordprocessingShape" xmlns:a="http://schemas.openxmlformats.org/drawingml/2006/main" xmlns:pic="http://schemas.openxmlformats.org/drawingml/2006/picture" xmlns:a14="http://schemas.microsoft.com/office/drawing/2010/main" mc:Ignorable="w14 w15 w16se w16cid w16 w16cex w16sdtdh wp14">
+<w:document xmlns:wpc="http://schemas.microsoft.com/office/word/2010/wordprocessingCanvas" xmlns:cx="http://schemas.microsoft.com/office/drawing/2014/chartex" xmlns:cx1="http://schemas.microsoft.com/office/drawing/2015/9/8/chartex" xmlns:cx2="http://schemas.microsoft.com/office/drawing/2015/10/21/chartex" xmlns:cx3="http://schemas.microsoft.com/office/drawing/2016/5/9/chartex" xmlns:cx4="http://schemas.microsoft.com/office/drawing/2016/5/10/chartex" xmlns:cx5="http://schemas.microsoft.com/office/drawing/2016/5/11/chartex" xmlns:cx6="http://schemas.microsoft.com/office/drawing/2016/5/12/chartex" xmlns:cx7="http://schemas.microsoft.com/office/drawing/2016/5/13/chartex" xmlns:cx8="http://schemas.microsoft.com/office/drawing/2016/5/14/chartex" xmlns:mc="http://schemas.openxmlformats.org/markup-compatibility/2006" xmlns:aink="http://schemas.microsoft.com/office/drawing/2016/ink" xmlns:am3d="http://schemas.microsoft.com/office/drawing/2017/model3d" xmlns:o="urn:schemas-microsoft-com:office:office" xmlns:r="http://schemas.openxmlformats.org/officeDocument/2006/relationships" xmlns:m="http://schemas.openxmlformats.org/officeDocument/2006/math" xmlns:v="urn:schemas-microsoft-com:vml" xmlns:wp14="http://schemas.microsoft.com/office/word/2010/wordprocessingDrawing" xmlns:wp="http://schemas.openxmlformats.org/drawingml/2006/wordprocessingDrawing" xmlns:w10="urn:schemas-microsoft-com:office:word" xmlns:w="http://schemas.openxmlformats.org/wordprocessingml/2006/main" xmlns:w14="http://schemas.microsoft.com/office/word/2010/wordml" xmlns:w15="http://schemas.microsoft.com/office/word/2012/wordml" xmlns:w16cex="http://schemas.microsoft.com/office/word/2018/wordml/cex" xmlns:w16cid="http://schemas.microsoft.com/office/word/2016/wordml/cid" xmlns:w16="http://schemas.microsoft.com/office/word/2018/wordml" xmlns:w16sdtdh="http://schemas.microsoft.com/office/word/2020/wordml/sdtdatahash" xmlns:w16se="http://schemas.microsoft.com/office/word/2015/wordml/symex" xmlns:wpg="http://schemas.microsoft.com/office/word/2010/wordprocessingGroup" xmlns:wpi="http://schemas.microsoft.com/office/word/2010/wordprocessingInk" xmlns:wne="http://schemas.microsoft.com/office/word/2006/wordml" xmlns:wps="http://schemas.microsoft.com/office/word/2010/wordprocessingShape" mc:Ignorable="w14 w15 w16se w16cid w16 w16cex w16sdtdh wp14">
   <w:body>
     <w:p>
       <w:pPr>
         <w:pStyle w:val="Heading1"/>
       </w:pPr>
       <w:r>
-        <w:t>Relief Supply Distribution System</w:t>
-      </w:r>
-      <w:r>
-        <w:t>: Scoring Documentation</w:t>
-      </w:r>
-    </w:p>
-    <w:p>
-      <w:r>
-        <w:t>This program manages relief supply distribution in case of a natural disaster such as an earthquake. Starting stock: 5 trucks, 120 supply packs. This program uses the data about the disaster to assign a severity index and a need score. Then, the need score</w:t>
-      </w:r>
-      <w:r>
-        <w:t xml:space="preserve"> is used to allocate the relief supply.</w:t>
-      </w:r>
-    </w:p>
-    <w:p>
-      <w:hyperlink w:history="1" r:id="rId5">
+        <w:t>Relief Supply Distribution System: Scoring Documentation</w:t>
+      </w:r>
+    </w:p>
+    <w:p>
+      <w:r>
+        <w:t>This program manages relief supply distribution in case of a natural disaster such as an earthquake. Starting stock: 5 trucks, 120 supply packs. This program uses the data about the disaster to assign a severity index and a need score. Then, the need score is used to allocate the relief supply.</w:t>
+      </w:r>
+    </w:p>
+    <w:p>
+      <w:hyperlink r:id="rId5" w:history="1">
         <w:r>
           <w:rPr>
             <w:rStyle w:val="Hyperlink"/>
@@ -35,25 +29,7 @@
           <w:rPr>
             <w:rStyle w:val="Hyperlink"/>
           </w:rPr>
-          <w:t xml:space="preserve"> </w:t>
-        </w:r>
-        <w:r>
-          <w:rPr>
-            <w:rStyle w:val="Hyperlink"/>
-          </w:rPr>
-          <w:t>https://github.com</w:t>
-        </w:r>
-        <w:r>
-          <w:rPr>
-            <w:rStyle w:val="Hyperlink"/>
-          </w:rPr>
-          <w:t>/</w:t>
-        </w:r>
-        <w:r>
-          <w:rPr>
-            <w:rStyle w:val="Hyperlink"/>
-          </w:rPr>
-          <w:t>The-Hacker-s-Den/FOCP-Assignment-1</w:t>
+          <w:t xml:space="preserve"> https://github.com/The-Hacker-s-Den/FOCP-Assignment-1</w:t>
         </w:r>
       </w:hyperlink>
     </w:p>
@@ -110,10 +86,7 @@
           </w:tcPr>
           <w:p>
             <w:r>
-              <w:t>Com</w:t>
-            </w:r>
-            <w:r>
-              <w:t>ponent</w:t>
+              <w:t>Component</w:t>
             </w:r>
           </w:p>
         </w:tc>
@@ -341,7 +314,6 @@
         <w:pStyle w:val="Heading3"/>
       </w:pPr>
       <w:r>
-        <w:rPr/>
         <w:t>1.3 Complexity points (C), 0 or 100</w:t>
       </w:r>
     </w:p>
@@ -354,10 +326,7 @@
         </w:numPr>
       </w:pPr>
       <w:r>
-        <w:t>A = 100 if the road is</w:t>
-      </w:r>
-      <w:r>
-        <w:t xml:space="preserve"> damaged. </w:t>
+        <w:t xml:space="preserve">A = 100 if the road is damaged. </w:t>
       </w:r>
     </w:p>
     <w:p>
@@ -382,7 +351,6 @@
     </w:p>
     <w:p>
       <w:r>
-        <w:rPr/>
         <w:t>N = (0.5 × People Points) + (0.4 × Impact Points) + (0.1 × Complexity Points)</w:t>
       </w:r>
     </w:p>
@@ -399,7 +367,6 @@
     </w:p>
     <w:p>
       <w:r>
-        <w:rPr/>
         <w:t>Category weights: People 50%, Impact 40%, Complexity 10%. Maximum N = 50 + 40 + 10 = 100.</w:t>
       </w:r>
     </w:p>
@@ -413,10 +380,7 @@
     </w:p>
     <w:p>
       <w:r>
-        <w:t>Category weights multiply the raw points. This table shows wha</w:t>
-      </w:r>
-      <w:r>
-        <w:t>t each input is actually worth on the 0–100 scale.</w:t>
+        <w:t>Category weights multiply the raw points. This table shows what each input is actually worth on the 0–100 scale.</w:t>
       </w:r>
     </w:p>
     <w:tbl>
@@ -439,7 +403,6 @@
           <w:tcPr>
             <w:tcW w:w="3120" w:type="dxa"/>
             <w:shd w:val="clear" w:color="auto" w:fill="F2F2F2" w:themeFill="background1" w:themeFillShade="F2"/>
-            <w:tcMar/>
           </w:tcPr>
           <w:p>
             <w:r>
@@ -451,7 +414,6 @@
           <w:tcPr>
             <w:tcW w:w="3120" w:type="dxa"/>
             <w:shd w:val="clear" w:color="auto" w:fill="F2F2F2" w:themeFill="background1" w:themeFillShade="F2"/>
-            <w:tcMar/>
           </w:tcPr>
           <w:p>
             <w:r>
@@ -463,7 +425,6 @@
           <w:tcPr>
             <w:tcW w:w="3120" w:type="dxa"/>
             <w:shd w:val="clear" w:color="auto" w:fill="F2F2F2" w:themeFill="background1" w:themeFillShade="F2"/>
-            <w:tcMar/>
           </w:tcPr>
           <w:p>
             <w:r>
@@ -476,7 +437,6 @@
         <w:tc>
           <w:tcPr>
             <w:tcW w:w="3120" w:type="dxa"/>
-            <w:tcMar/>
           </w:tcPr>
           <w:p>
             <w:r>
@@ -487,27 +447,16 @@
         <w:tc>
           <w:tcPr>
             <w:tcW w:w="3120" w:type="dxa"/>
-            <w:tcMar/>
-          </w:tcPr>
-          <w:p>
-            <w:r>
-              <w:rPr/>
-              <w:t xml:space="preserve">30 (of </w:t>
-            </w:r>
-            <w:r>
-              <w:rPr/>
-              <w:t>People</w:t>
-            </w:r>
-            <w:r>
-              <w:rPr/>
-              <w:t xml:space="preserve"> Points)</w:t>
-            </w:r>
-          </w:p>
-        </w:tc>
-        <w:tc>
-          <w:tcPr>
-            <w:tcW w:w="3120" w:type="dxa"/>
-            <w:tcMar/>
+          </w:tcPr>
+          <w:p>
+            <w:r>
+              <w:t>30 (of People Points)</w:t>
+            </w:r>
+          </w:p>
+        </w:tc>
+        <w:tc>
+          <w:tcPr>
+            <w:tcW w:w="3120" w:type="dxa"/>
           </w:tcPr>
           <w:p>
             <w:r>
@@ -520,7 +469,6 @@
         <w:tc>
           <w:tcPr>
             <w:tcW w:w="3120" w:type="dxa"/>
-            <w:tcMar/>
           </w:tcPr>
           <w:p>
             <w:r>
@@ -531,27 +479,16 @@
         <w:tc>
           <w:tcPr>
             <w:tcW w:w="3120" w:type="dxa"/>
-            <w:tcMar/>
-          </w:tcPr>
-          <w:p>
-            <w:r>
-              <w:rPr/>
-              <w:t xml:space="preserve">25 (of </w:t>
-            </w:r>
-            <w:r>
-              <w:rPr/>
-              <w:t>People</w:t>
-            </w:r>
-            <w:r>
-              <w:rPr/>
-              <w:t xml:space="preserve"> Points)</w:t>
-            </w:r>
-          </w:p>
-        </w:tc>
-        <w:tc>
-          <w:tcPr>
-            <w:tcW w:w="3120" w:type="dxa"/>
-            <w:tcMar/>
+          </w:tcPr>
+          <w:p>
+            <w:r>
+              <w:t>25 (of People Points)</w:t>
+            </w:r>
+          </w:p>
+        </w:tc>
+        <w:tc>
+          <w:tcPr>
+            <w:tcW w:w="3120" w:type="dxa"/>
           </w:tcPr>
           <w:p>
             <w:r>
@@ -564,7 +501,6 @@
         <w:tc>
           <w:tcPr>
             <w:tcW w:w="3120" w:type="dxa"/>
-            <w:tcMar/>
           </w:tcPr>
           <w:p>
             <w:r>
@@ -575,27 +511,16 @@
         <w:tc>
           <w:tcPr>
             <w:tcW w:w="3120" w:type="dxa"/>
-            <w:tcMar/>
-          </w:tcPr>
-          <w:p>
-            <w:r>
-              <w:rPr/>
-              <w:t xml:space="preserve">15 (of </w:t>
-            </w:r>
-            <w:r>
-              <w:rPr/>
-              <w:t>People</w:t>
-            </w:r>
-            <w:r>
-              <w:rPr/>
-              <w:t xml:space="preserve"> Points)</w:t>
-            </w:r>
-          </w:p>
-        </w:tc>
-        <w:tc>
-          <w:tcPr>
-            <w:tcW w:w="3120" w:type="dxa"/>
-            <w:tcMar/>
+          </w:tcPr>
+          <w:p>
+            <w:r>
+              <w:t>15 (of People Points)</w:t>
+            </w:r>
+          </w:p>
+        </w:tc>
+        <w:tc>
+          <w:tcPr>
+            <w:tcW w:w="3120" w:type="dxa"/>
           </w:tcPr>
           <w:p>
             <w:r>
@@ -608,7 +533,6 @@
         <w:tc>
           <w:tcPr>
             <w:tcW w:w="3120" w:type="dxa"/>
-            <w:tcMar/>
           </w:tcPr>
           <w:p>
             <w:r>
@@ -619,27 +543,16 @@
         <w:tc>
           <w:tcPr>
             <w:tcW w:w="3120" w:type="dxa"/>
-            <w:tcMar/>
-          </w:tcPr>
-          <w:p>
-            <w:r>
-              <w:rPr/>
-              <w:t xml:space="preserve">10 (of </w:t>
-            </w:r>
-            <w:r>
-              <w:rPr/>
-              <w:t>People</w:t>
-            </w:r>
-            <w:r>
-              <w:rPr/>
-              <w:t xml:space="preserve"> Points)</w:t>
-            </w:r>
-          </w:p>
-        </w:tc>
-        <w:tc>
-          <w:tcPr>
-            <w:tcW w:w="3120" w:type="dxa"/>
-            <w:tcMar/>
+          </w:tcPr>
+          <w:p>
+            <w:r>
+              <w:t>10 (of People Points)</w:t>
+            </w:r>
+          </w:p>
+        </w:tc>
+        <w:tc>
+          <w:tcPr>
+            <w:tcW w:w="3120" w:type="dxa"/>
           </w:tcPr>
           <w:p>
             <w:r>
@@ -652,7 +565,6 @@
         <w:tc>
           <w:tcPr>
             <w:tcW w:w="3120" w:type="dxa"/>
-            <w:tcMar/>
           </w:tcPr>
           <w:p>
             <w:r>
@@ -663,27 +575,16 @@
         <w:tc>
           <w:tcPr>
             <w:tcW w:w="3120" w:type="dxa"/>
-            <w:tcMar/>
-          </w:tcPr>
-          <w:p>
-            <w:r>
-              <w:rPr/>
-              <w:t xml:space="preserve">5–20 (of </w:t>
-            </w:r>
-            <w:r>
-              <w:rPr/>
-              <w:t>People</w:t>
-            </w:r>
-            <w:r>
-              <w:rPr/>
-              <w:t xml:space="preserve"> Points)</w:t>
-            </w:r>
-          </w:p>
-        </w:tc>
-        <w:tc>
-          <w:tcPr>
-            <w:tcW w:w="3120" w:type="dxa"/>
-            <w:tcMar/>
+          </w:tcPr>
+          <w:p>
+            <w:r>
+              <w:t>5–20 (of People Points)</w:t>
+            </w:r>
+          </w:p>
+        </w:tc>
+        <w:tc>
+          <w:tcPr>
+            <w:tcW w:w="3120" w:type="dxa"/>
           </w:tcPr>
           <w:p>
             <w:r>
@@ -696,7 +597,6 @@
         <w:tc>
           <w:tcPr>
             <w:tcW w:w="3120" w:type="dxa"/>
-            <w:tcMar/>
           </w:tcPr>
           <w:p>
             <w:r>
@@ -707,7 +607,6 @@
         <w:tc>
           <w:tcPr>
             <w:tcW w:w="3120" w:type="dxa"/>
-            <w:tcMar/>
           </w:tcPr>
           <w:p>
             <w:r>
@@ -718,7 +617,6 @@
         <w:tc>
           <w:tcPr>
             <w:tcW w:w="3120" w:type="dxa"/>
-            <w:tcMar/>
           </w:tcPr>
           <w:p>
             <w:r>
@@ -731,7 +629,6 @@
         <w:tc>
           <w:tcPr>
             <w:tcW w:w="3120" w:type="dxa"/>
-            <w:tcMar/>
           </w:tcPr>
           <w:p>
             <w:r>
@@ -742,7 +639,6 @@
         <w:tc>
           <w:tcPr>
             <w:tcW w:w="3120" w:type="dxa"/>
-            <w:tcMar/>
           </w:tcPr>
           <w:p>
             <w:r>
@@ -753,7 +649,6 @@
         <w:tc>
           <w:tcPr>
             <w:tcW w:w="3120" w:type="dxa"/>
-            <w:tcMar/>
           </w:tcPr>
           <w:p>
             <w:r>
@@ -766,7 +661,6 @@
         <w:tc>
           <w:tcPr>
             <w:tcW w:w="3120" w:type="dxa"/>
-            <w:tcMar/>
           </w:tcPr>
           <w:p>
             <w:r>
@@ -777,11 +671,9 @@
         <w:tc>
           <w:tcPr>
             <w:tcW w:w="3120" w:type="dxa"/>
-            <w:tcMar/>
-          </w:tcPr>
-          <w:p>
-            <w:r>
-              <w:rPr/>
+          </w:tcPr>
+          <w:p>
+            <w:r>
               <w:t>100 (of Complexity Points)</w:t>
             </w:r>
           </w:p>
@@ -789,7 +681,6 @@
         <w:tc>
           <w:tcPr>
             <w:tcW w:w="3120" w:type="dxa"/>
-            <w:tcMar/>
           </w:tcPr>
           <w:p>
             <w:r>
@@ -802,7 +693,6 @@
         <w:tc>
           <w:tcPr>
             <w:tcW w:w="3120" w:type="dxa"/>
-            <w:tcMar/>
           </w:tcPr>
           <w:p>
             <w:r>
@@ -813,28 +703,20 @@
         <w:tc>
           <w:tcPr>
             <w:tcW w:w="3120" w:type="dxa"/>
-            <w:tcMar/>
-          </w:tcPr>
-          <w:p>
-            <w:r>
-              <w:t>−</w:t>
-            </w:r>
-            <w:r>
-              <w:t>10 flat</w:t>
-            </w:r>
-          </w:p>
-        </w:tc>
-        <w:tc>
-          <w:tcPr>
-            <w:tcW w:w="3120" w:type="dxa"/>
-            <w:tcMar/>
-          </w:tcPr>
-          <w:p>
-            <w:r>
-              <w:t>−</w:t>
-            </w:r>
-            <w:r>
-              <w:t>10.0</w:t>
+          </w:tcPr>
+          <w:p>
+            <w:r>
+              <w:t>−10 flat</w:t>
+            </w:r>
+          </w:p>
+        </w:tc>
+        <w:tc>
+          <w:tcPr>
+            <w:tcW w:w="3120" w:type="dxa"/>
+          </w:tcPr>
+          <w:p>
+            <w:r>
+              <w:t>−10.0</w:t>
             </w:r>
           </w:p>
         </w:tc>
@@ -842,7 +724,6 @@
     </w:tbl>
     <w:p>
       <w:r>
-        <w:rPr/>
         <w:t>Totals: People inputs 15 + 12.5 + 7.5 + 5 + 10 = 50. Impact inputs 24 + 16 = 40. Complexity 10.</w:t>
       </w:r>
     </w:p>
@@ -883,10 +764,7 @@
         </w:numPr>
       </w:pPr>
       <w:r>
-        <w:t>Medical need, trapped people, vulnerable groups, clinic working, aftershock warning, road o</w:t>
-      </w:r>
-      <w:r>
-        <w:t>pen, prior aid: yes or no.</w:t>
+        <w:t>Medical need, trapped people, vulnerable groups, clinic working, aftershock warning, road open, prior aid: yes or no.</w:t>
       </w:r>
     </w:p>
     <w:p>
@@ -1194,10 +1072,7 @@
         </w:numPr>
       </w:pPr>
       <w:r>
-        <w:t>Dispatch test: the package is sent only if trucks in stock ≥ trucks required AND supply packs in stock ≥ packs required. Bo</w:t>
-      </w:r>
-      <w:r>
-        <w:t>th conditions must hold.</w:t>
+        <w:t>Dispatch test: the package is sent only if trucks in stock ≥ trucks required AND supply packs in stock ≥ packs required. Both conditions must hold.</w:t>
       </w:r>
     </w:p>
     <w:p>
@@ -1305,10 +1180,7 @@
           </w:tcPr>
           <w:p>
             <w:r>
-              <w:t>65 or</w:t>
-            </w:r>
-            <w:r>
-              <w:t xml:space="preserve"> more</w:t>
+              <w:t>65 or more</w:t>
             </w:r>
           </w:p>
         </w:tc>
@@ -1459,10 +1331,7 @@
         </w:numPr>
       </w:pPr>
       <w:r>
-        <w:t>Deferred: not enough stock: the score earned a package but stock ca</w:t>
-      </w:r>
-      <w:r>
-        <w:t>nnot fund even the smallest one (1 truck, 10 packs). Supply gap, not a need judgement. Signals that restocking is required.</w:t>
+        <w:t>Deferred: not enough stock: the score earned a package but stock cannot fund even the smallest one (1 truck, 10 packs). Supply gap, not a need judgement. Signals that restocking is required.</w:t>
       </w:r>
     </w:p>
     <w:p>
@@ -1487,10 +1356,7 @@
         </w:numPr>
       </w:pPr>
       <w:r>
-        <w:t>After each request the system shows the area, the action taken</w:t>
-      </w:r>
-      <w:r>
-        <w:t>, trucks used, packs used and remaining stock.</w:t>
+        <w:t>After each request the system shows the area, the action taken, trucks used, packs used and remaining stock.</w:t>
       </w:r>
     </w:p>
     <w:p>
@@ -1512,102 +1378,61 @@
           <w:ilvl w:val="0"/>
           <w:numId w:val="7"/>
         </w:numPr>
-        <w:rPr/>
-      </w:pPr>
-      <w:r>
-        <w:rPr/>
+      </w:pPr>
+      <w:r>
         <w:t>At the end of an earthquake the summary shows requests served, requests deferred, and trucks and packs remaining.</w:t>
       </w:r>
     </w:p>
     <w:p>
       <w:pPr>
         <w:pStyle w:val="Heading2"/>
-        <w:suppressLineNumbers w:val="0"/>
-        <w:bidi w:val="0"/>
-        <w:spacing w:before="280" w:beforeAutospacing="off" w:after="100" w:afterAutospacing="off" w:line="259" w:lineRule="auto"/>
-        <w:ind w:left="0" w:right="0"/>
-        <w:jc w:val="left"/>
-      </w:pPr>
-      <w:r>
-        <w:rPr/>
+      </w:pPr>
+      <w:r>
+        <w:lastRenderedPageBreak/>
         <w:t>3. Sample Tests</w:t>
       </w:r>
     </w:p>
     <w:p>
-      <w:pPr>
-        <w:pStyle w:val="Normal"/>
-        <w:bidi w:val="0"/>
-      </w:pPr>
-      <w:r>
-        <w:rPr/>
+      <w:r>
         <w:t xml:space="preserve">The following sample tests were performed to test the program's </w:t>
       </w:r>
       <w:r>
+        <w:t>processing of the requests and it's behavior when trucks and/or supply packs run out.</w:t>
+      </w:r>
+    </w:p>
+    <w:p>
+      <w:pPr>
+        <w:pStyle w:val="Heading3"/>
+      </w:pPr>
+      <w:r>
+        <w:t xml:space="preserve">3.1 </w:t>
+      </w:r>
+      <w:r>
+        <w:t>R1 – Riverside Village (Sufficient Resources)</w:t>
+      </w:r>
+    </w:p>
+    <w:p>
+      <w:r>
         <w:rPr>
-          <w:rFonts w:ascii="Calibri" w:hAnsi="Calibri" w:eastAsia="Calibri" w:cs="Calibri"/>
-          <w:noProof w:val="0"/>
-          <w:sz w:val="22"/>
-          <w:szCs w:val="22"/>
-          <w:lang w:val="en-US"/>
+          <w:noProof/>
         </w:rPr>
-        <w:t xml:space="preserve">processing of the requests and </w:t>
-      </w:r>
-      <w:r>
-        <w:rPr>
-          <w:rFonts w:ascii="Calibri" w:hAnsi="Calibri" w:eastAsia="Calibri" w:cs="Calibri"/>
-          <w:noProof w:val="0"/>
-          <w:sz w:val="22"/>
-          <w:szCs w:val="22"/>
-          <w:lang w:val="en-US"/>
-        </w:rPr>
-        <w:t>it's</w:t>
-      </w:r>
-      <w:r>
-        <w:rPr>
-          <w:rFonts w:ascii="Calibri" w:hAnsi="Calibri" w:eastAsia="Calibri" w:cs="Calibri"/>
-          <w:noProof w:val="0"/>
-          <w:sz w:val="22"/>
-          <w:szCs w:val="22"/>
-          <w:lang w:val="en-US"/>
-        </w:rPr>
-        <w:t xml:space="preserve"> behavior when trucks and/or supply packs run out.</w:t>
-      </w:r>
-    </w:p>
-    <w:p>
-      <w:pPr>
-        <w:pStyle w:val="Heading3"/>
-      </w:pPr>
-      <w:r>
-        <w:rPr/>
-        <w:t xml:space="preserve">3.1 </w:t>
-      </w:r>
-      <w:r>
-        <w:rPr/>
-        <w:t>R1 – Riverside Village (Sufficient Resources)</w:t>
-      </w:r>
-    </w:p>
-    <w:p>
-      <w:pPr>
-        <w:pStyle w:val="Normal"/>
-      </w:pPr>
-      <w:r>
         <w:drawing>
-          <wp:inline wp14:editId="5009D56C" wp14:anchorId="19C4079C">
+          <wp:inline distT="0" distB="0" distL="0" distR="0" wp14:anchorId="19C4079C" wp14:editId="5009D56C">
             <wp:extent cx="5188216" cy="4172165"/>
             <wp:effectExtent l="0" t="0" r="0" b="0"/>
             <wp:docPr id="966454875" name="drawing"/>
             <wp:cNvGraphicFramePr>
-              <a:graphicFrameLocks noChangeAspect="1"/>
+              <a:graphicFrameLocks xmlns:a="http://schemas.openxmlformats.org/drawingml/2006/main" noChangeAspect="1"/>
             </wp:cNvGraphicFramePr>
-            <a:graphic>
-              <a:graphicData xmlns:a="http://schemas.openxmlformats.org/drawingml/2006/main" uri="http://schemas.openxmlformats.org/drawingml/2006/picture">
+            <a:graphic xmlns:a="http://schemas.openxmlformats.org/drawingml/2006/main">
+              <a:graphicData uri="http://schemas.openxmlformats.org/drawingml/2006/picture">
                 <pic:pic xmlns:pic="http://schemas.openxmlformats.org/drawingml/2006/picture">
                   <pic:nvPicPr>
                     <pic:cNvPr id="966454875" name="Picture 966454875"/>
                     <pic:cNvPicPr/>
                   </pic:nvPicPr>
                   <pic:blipFill>
-                    <a:blip xmlns:r="http://schemas.openxmlformats.org/officeDocument/2006/relationships" r:embed="rId590013154">
+                    <a:blip r:embed="rId6">
                       <a:extLst>
                         <a:ext uri="{28A0092B-C50C-407E-A947-70E740481C1C}">
                           <a14:useLocalDpi xmlns:a14="http://schemas.microsoft.com/office/drawing/2010/main"/>
@@ -1639,32 +1464,32 @@
         <w:pStyle w:val="Heading3"/>
       </w:pPr>
       <w:r>
-        <w:rPr/>
+        <w:lastRenderedPageBreak/>
         <w:t>3.2 R2 – Hilltop Settlement (Sufficient Resources)</w:t>
       </w:r>
     </w:p>
     <w:p>
-      <w:pPr>
-        <w:pStyle w:val="Normal"/>
-      </w:pPr>
-      <w:r>
+      <w:r>
+        <w:rPr>
+          <w:noProof/>
+        </w:rPr>
         <w:drawing>
-          <wp:inline wp14:editId="77E122BA" wp14:anchorId="6E015CC0">
+          <wp:inline distT="0" distB="0" distL="0" distR="0" wp14:anchorId="6E015CC0" wp14:editId="77E122BA">
             <wp:extent cx="5277121" cy="4159464"/>
             <wp:effectExtent l="0" t="0" r="0" b="0"/>
             <wp:docPr id="521575906" name="drawing"/>
             <wp:cNvGraphicFramePr>
-              <a:graphicFrameLocks noChangeAspect="1"/>
+              <a:graphicFrameLocks xmlns:a="http://schemas.openxmlformats.org/drawingml/2006/main" noChangeAspect="1"/>
             </wp:cNvGraphicFramePr>
-            <a:graphic>
-              <a:graphicData xmlns:a="http://schemas.openxmlformats.org/drawingml/2006/main" uri="http://schemas.openxmlformats.org/drawingml/2006/picture">
+            <a:graphic xmlns:a="http://schemas.openxmlformats.org/drawingml/2006/main">
+              <a:graphicData uri="http://schemas.openxmlformats.org/drawingml/2006/picture">
                 <pic:pic xmlns:pic="http://schemas.openxmlformats.org/drawingml/2006/picture">
                   <pic:nvPicPr>
                     <pic:cNvPr id="521575906" name="Picture 521575906"/>
                     <pic:cNvPicPr/>
                   </pic:nvPicPr>
                   <pic:blipFill>
-                    <a:blip xmlns:r="http://schemas.openxmlformats.org/officeDocument/2006/relationships" r:embed="rId2014842373">
+                    <a:blip r:embed="rId7">
                       <a:extLst>
                         <a:ext uri="{28A0092B-C50C-407E-A947-70E740481C1C}">
                           <a14:useLocalDpi xmlns:a14="http://schemas.microsoft.com/office/drawing/2010/main"/>
@@ -1694,63 +1519,52 @@
     <w:p>
       <w:pPr>
         <w:pStyle w:val="Heading3"/>
-        <w:suppressLineNumbers w:val="0"/>
-        <w:bidi w:val="0"/>
-        <w:spacing w:before="240" w:beforeAutospacing="off" w:after="80" w:afterAutospacing="off" w:line="259" w:lineRule="auto"/>
-        <w:ind w:left="0" w:right="0"/>
-        <w:jc w:val="left"/>
-      </w:pPr>
-      <w:r>
-        <w:rPr/>
+      </w:pPr>
+      <w:r>
+        <w:lastRenderedPageBreak/>
         <w:t>3.</w:t>
       </w:r>
       <w:r>
-        <w:rPr/>
         <w:t>3</w:t>
       </w:r>
       <w:r>
-        <w:rPr/>
         <w:t xml:space="preserve"> R</w:t>
       </w:r>
       <w:r>
-        <w:rPr/>
         <w:t>3</w:t>
       </w:r>
       <w:r>
-        <w:rPr/>
         <w:t xml:space="preserve"> – </w:t>
       </w:r>
       <w:r>
-        <w:rPr/>
         <w:t>Lakeside Camp</w:t>
       </w:r>
       <w:r>
-        <w:rPr/>
         <w:t xml:space="preserve"> (Sufficient Resources)</w:t>
       </w:r>
     </w:p>
     <w:p>
-      <w:pPr>
-        <w:pStyle w:val="Normal"/>
-      </w:pPr>
-      <w:r>
+      <w:r>
+        <w:rPr>
+          <w:noProof/>
+        </w:rPr>
         <w:drawing>
-          <wp:inline wp14:editId="5FB84B9E" wp14:anchorId="182C2006">
+          <wp:inline distT="0" distB="0" distL="0" distR="0" wp14:anchorId="182C2006" wp14:editId="5FB84B9E">
             <wp:extent cx="5112013" cy="4102311"/>
             <wp:effectExtent l="0" t="0" r="0" b="0"/>
             <wp:docPr id="2120089011" name="drawing"/>
             <wp:cNvGraphicFramePr>
-              <a:graphicFrameLocks noChangeAspect="1"/>
+              <a:graphicFrameLocks xmlns:a="http://schemas.openxmlformats.org/drawingml/2006/main" noChangeAspect="1"/>
             </wp:cNvGraphicFramePr>
-            <a:graphic>
-              <a:graphicData xmlns:a="http://schemas.openxmlformats.org/drawingml/2006/main" uri="http://schemas.openxmlformats.org/drawingml/2006/picture">
+            <a:graphic xmlns:a="http://schemas.openxmlformats.org/drawingml/2006/main">
+              <a:graphicData uri="http://schemas.openxmlformats.org/drawingml/2006/picture">
                 <pic:pic xmlns:pic="http://schemas.openxmlformats.org/drawingml/2006/picture">
                   <pic:nvPicPr>
                     <pic:cNvPr id="2120089011" name="Picture 2120089011"/>
                     <pic:cNvPicPr/>
                   </pic:nvPicPr>
                   <pic:blipFill>
-                    <a:blip xmlns:r="http://schemas.openxmlformats.org/officeDocument/2006/relationships" r:embed="rId128292894">
+                    <a:blip r:embed="rId8">
                       <a:extLst>
                         <a:ext uri="{28A0092B-C50C-407E-A947-70E740481C1C}">
                           <a14:useLocalDpi xmlns:a14="http://schemas.microsoft.com/office/drawing/2010/main"/>
@@ -1780,55 +1594,42 @@
     <w:p>
       <w:pPr>
         <w:pStyle w:val="Heading3"/>
-        <w:keepNext w:val="1"/>
-        <w:suppressLineNumbers w:val="0"/>
-        <w:bidi w:val="0"/>
-        <w:spacing w:before="240" w:beforeAutospacing="off" w:after="80" w:afterAutospacing="off" w:line="259" w:lineRule="auto"/>
-        <w:ind w:left="0" w:right="0"/>
-        <w:jc w:val="left"/>
       </w:pPr>
       <w:r>
         <w:rPr>
-          <w:rFonts w:ascii="Calibri" w:hAnsi="Calibri" w:eastAsia="Calibri" w:cs="Calibri"/>
-          <w:b w:val="1"/>
-          <w:bCs w:val="1"/>
-          <w:i w:val="0"/>
-          <w:iCs w:val="0"/>
-          <w:caps w:val="0"/>
-          <w:smallCaps w:val="0"/>
-          <w:noProof w:val="0"/>
-          <w:color w:val="000000" w:themeColor="text1" w:themeTint="FF" w:themeShade="FF"/>
-          <w:sz w:val="24"/>
+          <w:bCs/>
+          <w:color w:val="000000" w:themeColor="text1"/>
           <w:szCs w:val="24"/>
-          <w:lang w:val="en-US"/>
         </w:rPr>
+        <w:lastRenderedPageBreak/>
         <w:t>3.4 R2 – Market Town (Insufficient Resources)</w:t>
       </w:r>
     </w:p>
     <w:p>
       <w:pPr>
-        <w:pStyle w:val="Normal"/>
-        <w:keepNext w:val="1"/>
-        <w:bidi w:val="0"/>
-      </w:pPr>
-      <w:r>
+        <w:keepNext/>
+      </w:pPr>
+      <w:r>
+        <w:rPr>
+          <w:noProof/>
+        </w:rPr>
         <w:drawing>
-          <wp:inline wp14:editId="125E537C" wp14:anchorId="48B2C71C">
+          <wp:inline distT="0" distB="0" distL="0" distR="0" wp14:anchorId="48B2C71C" wp14:editId="125E537C">
             <wp:extent cx="3952875" cy="5943600"/>
             <wp:effectExtent l="0" t="0" r="0" b="0"/>
             <wp:docPr id="501064666" name="drawing"/>
             <wp:cNvGraphicFramePr>
-              <a:graphicFrameLocks noChangeAspect="1"/>
+              <a:graphicFrameLocks xmlns:a="http://schemas.openxmlformats.org/drawingml/2006/main" noChangeAspect="1"/>
             </wp:cNvGraphicFramePr>
-            <a:graphic>
-              <a:graphicData xmlns:a="http://schemas.openxmlformats.org/drawingml/2006/main" uri="http://schemas.openxmlformats.org/drawingml/2006/picture">
+            <a:graphic xmlns:a="http://schemas.openxmlformats.org/drawingml/2006/main">
+              <a:graphicData uri="http://schemas.openxmlformats.org/drawingml/2006/picture">
                 <pic:pic xmlns:pic="http://schemas.openxmlformats.org/drawingml/2006/picture">
                   <pic:nvPicPr>
                     <pic:cNvPr id="501064666" name="Picture 501064666"/>
                     <pic:cNvPicPr/>
                   </pic:nvPicPr>
                   <pic:blipFill>
-                    <a:blip xmlns:r="http://schemas.openxmlformats.org/officeDocument/2006/relationships" r:embed="rId1224603510">
+                    <a:blip r:embed="rId9">
                       <a:extLst>
                         <a:ext uri="{28A0092B-C50C-407E-A947-70E740481C1C}">
                           <a14:useLocalDpi xmlns:a14="http://schemas.microsoft.com/office/drawing/2010/main"/>
@@ -1858,25 +1659,10 @@
     <w:p>
       <w:pPr>
         <w:pStyle w:val="Heading3"/>
-        <w:keepNext w:val="1"/>
-        <w:suppressLineNumbers w:val="0"/>
-        <w:bidi w:val="0"/>
-        <w:spacing w:before="240" w:beforeAutospacing="off" w:after="80" w:afterAutospacing="off" w:line="259" w:lineRule="auto"/>
-        <w:ind w:left="0" w:right="0"/>
-        <w:jc w:val="left"/>
         <w:rPr>
-          <w:rFonts w:ascii="Calibri" w:hAnsi="Calibri" w:eastAsia="Calibri" w:cs="Calibri"/>
-          <w:b w:val="1"/>
-          <w:bCs w:val="1"/>
-          <w:i w:val="0"/>
-          <w:iCs w:val="0"/>
-          <w:caps w:val="0"/>
-          <w:smallCaps w:val="0"/>
-          <w:noProof w:val="0"/>
-          <w:color w:val="000000" w:themeColor="text1" w:themeTint="FF" w:themeShade="FF"/>
-          <w:sz w:val="24"/>
+          <w:bCs/>
+          <w:color w:val="000000" w:themeColor="text1"/>
           <w:szCs w:val="24"/>
-          <w:lang w:val="en-US"/>
         </w:rPr>
       </w:pPr>
     </w:p>
@@ -1888,72 +1674,58 @@
     <w:p>
       <w:pPr>
         <w:pStyle w:val="Heading3"/>
-        <w:keepNext w:val="1"/>
-        <w:suppressLineNumbers w:val="0"/>
-        <w:bidi w:val="0"/>
-        <w:spacing w:before="240" w:beforeAutospacing="off" w:after="80" w:afterAutospacing="off" w:line="259" w:lineRule="auto"/>
-        <w:ind w:left="0" w:right="0"/>
-        <w:jc w:val="left"/>
-      </w:pPr>
-      <w:r>
         <w:rPr>
-          <w:rFonts w:ascii="Calibri" w:hAnsi="Calibri" w:eastAsia="Calibri" w:cs="Calibri"/>
-          <w:b w:val="1"/>
-          <w:bCs w:val="1"/>
-          <w:i w:val="0"/>
-          <w:iCs w:val="0"/>
-          <w:caps w:val="0"/>
-          <w:smallCaps w:val="0"/>
-          <w:noProof w:val="0"/>
-          <w:color w:val="000000" w:themeColor="text1" w:themeTint="FF" w:themeShade="FF"/>
-          <w:sz w:val="24"/>
+          <w:bCs/>
+          <w:color w:val="000000" w:themeColor="text1"/>
           <w:szCs w:val="24"/>
-          <w:lang w:val="en-US"/>
         </w:rPr>
+      </w:pPr>
+      <w:r>
+        <w:rPr>
+          <w:bCs/>
+          <w:color w:val="000000" w:themeColor="text1"/>
+          <w:szCs w:val="24"/>
+        </w:rPr>
+        <w:lastRenderedPageBreak/>
         <w:t>3.5 R5</w:t>
       </w:r>
       <w:r>
+        <w:t xml:space="preserve"> Bridge Colony</w:t>
+      </w:r>
+      <w:r>
         <w:rPr>
-          <w:noProof w:val="0"/>
-          <w:lang w:val="en-US"/>
+          <w:bCs/>
+          <w:color w:val="000000" w:themeColor="text1"/>
+          <w:szCs w:val="24"/>
         </w:rPr>
-        <w:t xml:space="preserve"> Bridge Colony</w:t>
-      </w:r>
+        <w:t xml:space="preserve"> (Insufficient Resources)</w:t>
+      </w:r>
+    </w:p>
+    <w:p>
+      <w:pPr>
+        <w:pStyle w:val="Heading3"/>
+      </w:pPr>
       <w:r>
         <w:rPr>
-          <w:rFonts w:ascii="Calibri" w:hAnsi="Calibri" w:eastAsia="Calibri" w:cs="Calibri"/>
-          <w:b w:val="1"/>
-          <w:bCs w:val="1"/>
-          <w:i w:val="0"/>
-          <w:iCs w:val="0"/>
-          <w:caps w:val="0"/>
-          <w:smallCaps w:val="0"/>
-          <w:noProof w:val="0"/>
-          <w:color w:val="000000" w:themeColor="text1" w:themeTint="FF" w:themeShade="FF"/>
-          <w:sz w:val="24"/>
-          <w:szCs w:val="24"/>
-          <w:lang w:val="en-US"/>
+          <w:noProof/>
         </w:rPr>
-        <w:t xml:space="preserve"> – Market Town (Insufficient Resources)</w:t>
-      </w:r>
-      <w:r>
         <w:drawing>
-          <wp:inline wp14:editId="343862AA" wp14:anchorId="1855D4F3">
+          <wp:inline distT="0" distB="0" distL="0" distR="0" wp14:anchorId="1855D4F3" wp14:editId="343862AA">
             <wp:extent cx="3990975" cy="5943600"/>
             <wp:effectExtent l="0" t="0" r="0" b="0"/>
             <wp:docPr id="1143461720" name="drawing"/>
             <wp:cNvGraphicFramePr>
-              <a:graphicFrameLocks noChangeAspect="1"/>
+              <a:graphicFrameLocks xmlns:a="http://schemas.openxmlformats.org/drawingml/2006/main" noChangeAspect="1"/>
             </wp:cNvGraphicFramePr>
-            <a:graphic>
-              <a:graphicData xmlns:a="http://schemas.openxmlformats.org/drawingml/2006/main" uri="http://schemas.openxmlformats.org/drawingml/2006/picture">
+            <a:graphic xmlns:a="http://schemas.openxmlformats.org/drawingml/2006/main">
+              <a:graphicData uri="http://schemas.openxmlformats.org/drawingml/2006/picture">
                 <pic:pic xmlns:pic="http://schemas.openxmlformats.org/drawingml/2006/picture">
                   <pic:nvPicPr>
                     <pic:cNvPr id="1143461720" name="Picture 1143461720"/>
                     <pic:cNvPicPr/>
                   </pic:nvPicPr>
                   <pic:blipFill>
-                    <a:blip xmlns:r="http://schemas.openxmlformats.org/officeDocument/2006/relationships" r:embed="rId1261434731">
+                    <a:blip r:embed="rId10">
                       <a:extLst>
                         <a:ext uri="{28A0092B-C50C-407E-A947-70E740481C1C}">
                           <a14:useLocalDpi xmlns:a14="http://schemas.microsoft.com/office/drawing/2010/main"/>
@@ -1980,34 +1752,21 @@
         </w:drawing>
       </w:r>
     </w:p>
-    <w:p>
-      <w:pPr>
-        <w:pStyle w:val="Normal"/>
-      </w:pPr>
-    </w:p>
+    <w:p/>
     <w:p>
       <w:pPr>
         <w:pStyle w:val="Heading2"/>
       </w:pPr>
       <w:r>
-        <w:rPr/>
         <w:t>4</w:t>
       </w:r>
       <w:r>
-        <w:rPr/>
-        <w:t>. Rati</w:t>
-      </w:r>
-      <w:r>
-        <w:rPr/>
-        <w:t>onale</w:t>
-      </w:r>
-    </w:p>
-    <w:p>
-      <w:r>
-        <w:t xml:space="preserve">The point values are design judgements by the project team. They are not statistically calibrated against historical disaster data. The reasons below justify why each input is in the model, its rank against the other inputs, and its size relative to </w:t>
-      </w:r>
-      <w:r>
-        <w:t>the package thresholds.</w:t>
+        <w:t>. Rationale</w:t>
+      </w:r>
+    </w:p>
+    <w:p>
+      <w:r>
+        <w:t>The point values are design judgements by the project team. They are not statistically calibrated against historical disaster data. The reasons below justify why each input is in the model, its rank against the other inputs, and its size relative to the package thresholds.</w:t>
       </w:r>
     </w:p>
     <w:p>
@@ -2015,32 +1774,14 @@
         <w:pStyle w:val="Heading3"/>
       </w:pPr>
       <w:r>
-        <w:rPr/>
         <w:t>4</w:t>
       </w:r>
       <w:r>
         <w:rPr>
-          <w:rFonts w:ascii="Calibri" w:hAnsi="Calibri" w:eastAsia="Calibri" w:cs="Calibri"/>
-          <w:b w:val="1"/>
-          <w:bCs w:val="1"/>
-          <w:color w:val="auto"/>
-          <w:sz w:val="24"/>
+          <w:bCs/>
           <w:szCs w:val="24"/>
-          <w:lang w:eastAsia="en-US" w:bidi="ar-SA"/>
         </w:rPr>
-        <w:t>.1</w:t>
-      </w:r>
-      <w:r>
-        <w:rPr>
-          <w:rFonts w:ascii="Calibri" w:hAnsi="Calibri" w:eastAsia="Calibri" w:cs="Calibri"/>
-          <w:b w:val="1"/>
-          <w:bCs w:val="1"/>
-          <w:color w:val="auto"/>
-          <w:sz w:val="24"/>
-          <w:szCs w:val="24"/>
-          <w:lang w:eastAsia="en-US" w:bidi="ar-SA"/>
-        </w:rPr>
-        <w:t xml:space="preserve"> Design principles</w:t>
+        <w:t>.1 Design principles</w:t>
       </w:r>
     </w:p>
     <w:p>
@@ -2064,6 +1805,7 @@
         </w:numPr>
       </w:pPr>
       <w:r>
+        <w:lastRenderedPageBreak/>
         <w:t>Condition before scale. A small area with entrapment must outrank a large area that is stable.</w:t>
       </w:r>
     </w:p>
@@ -2086,15 +1828,9 @@
           <w:ilvl w:val="0"/>
           <w:numId w:val="8"/>
         </w:numPr>
-        <w:rPr/>
-      </w:pPr>
-      <w:r>
-        <w:rPr/>
-        <w:t>Delivery difficulty adj</w:t>
-      </w:r>
-      <w:r>
-        <w:rPr/>
-        <w:t>usts the response but does not measure suffering. Complexity carries the smallest weight (10%).</w:t>
+      </w:pPr>
+      <w:r>
+        <w:t>Delivery difficulty adjusts the response but does not measure suffering. Complexity carries the smallest weight (10%).</w:t>
       </w:r>
     </w:p>
     <w:p>
@@ -2126,10 +1862,7 @@
         </w:numPr>
       </w:pPr>
       <w:r>
-        <w:t>Some help beats no help. When stock is short the syst</w:t>
-      </w:r>
-      <w:r>
-        <w:t>em sends a smaller package instead of refusing.</w:t>
+        <w:t>Some help beats no help. When stock is short the system sends a smaller package instead of refusing.</w:t>
       </w:r>
     </w:p>
     <w:p>
@@ -2137,11 +1870,9 @@
         <w:pStyle w:val="Heading3"/>
       </w:pPr>
       <w:r>
-        <w:rPr/>
         <w:t>4</w:t>
       </w:r>
       <w:r>
-        <w:rPr/>
         <w:t>.2 Reason for every input weight</w:t>
       </w:r>
     </w:p>
@@ -2153,10 +1884,7 @@
         <w:t>Trapped people: 30 raw, 15.0 final. Highest person-level weight.</w:t>
       </w:r>
       <w:r>
-        <w:t xml:space="preserve"> Survival of people trapped in collapsed structures falls steeply with time. Urban search and rescue operation</w:t>
-      </w:r>
-      <w:r>
-        <w:t>s are planned around the first 72 hours. A delay here is irreversible: a life lost cannot be recovered by later aid. Trapped people also indicate collapse and injury in the same area.</w:t>
+        <w:t xml:space="preserve"> Survival of people trapped in collapsed structures falls steeply with time. Urban search and rescue operations are planned around the first 72 hours. A delay here is irreversible: a life lost cannot be recovered by later aid. Trapped people also indicate collapse and injury in the same area.</w:t>
       </w:r>
     </w:p>
     <w:p>
@@ -2167,10 +1895,7 @@
         <w:t>Medical need: 25 raw, 12.5 final.</w:t>
       </w:r>
       <w:r>
-        <w:t xml:space="preserve"> Untreated injuries such as bleeding, c</w:t>
-      </w:r>
-      <w:r>
-        <w:t>rush injuries, fractures and infection deteriorate within hours to days. A medical need turns delay into avoidable death and permanent disability. Ranked below entrapment because entrapment is the more time-critical of the two.</w:t>
+        <w:t xml:space="preserve"> Untreated injuries such as bleeding, crush injuries, fractures and infection deteriorate within hours to days. A medical need turns delay into avoidable death and permanent disability. Ranked below entrapment because entrapment is the more time-critical of the two.</w:t>
       </w:r>
     </w:p>
     <w:p>
@@ -2178,19 +1903,10 @@
         <w:rPr>
           <w:b/>
         </w:rPr>
-        <w:t>Vulnerable groups present: 1</w:t>
-      </w:r>
-      <w:r>
-        <w:rPr>
-          <w:b/>
-        </w:rPr>
-        <w:t>5 raw, 7.5 final.</w:t>
-      </w:r>
-      <w:r>
-        <w:t xml:space="preserve"> Children, elderly people and people with disabilities have higher mortality in disasters and depend on others for evacuation, water, food and medication. They are often treated as priority groups. Weighted below trapped and medical becaus</w:t>
-      </w:r>
-      <w:r>
-        <w:t>e this input describes who is exposed, not an active life-threatening event.</w:t>
+        <w:t>Vulnerable groups present: 15 raw, 7.5 final.</w:t>
+      </w:r>
+      <w:r>
+        <w:t xml:space="preserve"> Children, elderly people and people with disabilities have higher mortality in disasters and depend on others for evacuation, water, food and medication. They are often treated as priority groups. Weighted below trapped and medical because this input describes who is exposed, not an active life-threatening event.</w:t>
       </w:r>
     </w:p>
     <w:p>
@@ -2201,10 +1917,7 @@
         <w:t>Local clinic not working: 10 raw, 5.0 final.</w:t>
       </w:r>
       <w:r>
-        <w:t xml:space="preserve"> A working clinic absorbs part of the medical load locally. When it is down, the full load falls on external aid. Lowest of the four co</w:t>
-      </w:r>
-      <w:r>
-        <w:t>ndition flags because it modifies the consequence of medical need and overlaps with it.</w:t>
+        <w:t xml:space="preserve"> A working clinic absorbs part of the medical load locally. When it is down, the full load falls on external aid. Lowest of the four condition flags because it modifies the consequence of medical need and overlaps with it.</w:t>
       </w:r>
     </w:p>
     <w:p>
@@ -2215,10 +1928,7 @@
         <w:t>Families affected: 5 / 10 / 15 / 20 raw, 2.5 to 10.0 final.</w:t>
       </w:r>
       <w:r>
-        <w:t xml:space="preserve"> The number of families sets how much material is needed. Even the maximum bracket (20) is below every condit</w:t>
-      </w:r>
-      <w:r>
-        <w:t>ion flag except clinic status and vulnerable groups, and below trapped (30) and medical (25), so a large stable area cannot outrank a small area with entrapment or injuries. Brackets are used instead of exact counts because early counts are estimates.</w:t>
+        <w:t xml:space="preserve"> The number of families sets how much material is needed. Even the maximum bracket (20) is below every condition flag except clinic status and vulnerable groups, and below trapped (30) and medical (25), so a large stable area cannot outrank a small area with entrapment or injuries. Brackets are used instead of exact counts because early counts are estimates.</w:t>
       </w:r>
     </w:p>
     <w:p>
@@ -2226,48 +1936,10 @@
         <w:rPr>
           <w:b/>
         </w:rPr>
-        <w:t>Infr</w:t>
-      </w:r>
-      <w:r>
-        <w:rPr>
-          <w:b/>
-        </w:rPr>
-        <w:t xml:space="preserve">astructure damage: 12 / 36 / 60 raw (ratio </w:t>
-      </w:r>
-      <w:proofErr w:type="gramStart"/>
-      <w:r>
-        <w:rPr>
-          <w:b/>
-        </w:rPr>
-        <w:t>1 :</w:t>
-      </w:r>
-      <w:proofErr w:type="gramEnd"/>
-      <w:r>
-        <w:rPr>
-          <w:b/>
-        </w:rPr>
-        <w:t xml:space="preserve"> 3 : 5), 4.8 / 14.4 / 24.0 final.</w:t>
-      </w:r>
-      <w:r>
-        <w:t xml:space="preserve"> Damage drives shelter loss, loss of water and power, and the number of entrapments. Low damage means mostly habitable buildings. Medium means partial uninhabitability. High mea</w:t>
-      </w:r>
-      <w:r>
-        <w:t xml:space="preserve">ns collapse and mass displacement. The </w:t>
-      </w:r>
-      <w:r>
-        <w:lastRenderedPageBreak/>
-        <w:t xml:space="preserve">steps are not proportional: the jump from Low to Medium (24 raw) is larger than from Medium to High (24 raw) only in ratio terms (3× then 1.7×), reflecting that any real structural damage changes </w:t>
-      </w:r>
-      <w:proofErr w:type="gramStart"/>
-      <w:r>
-        <w:t>needs</w:t>
-      </w:r>
-      <w:proofErr w:type="gramEnd"/>
-      <w:r>
-        <w:t xml:space="preserve"> sharply. High d</w:t>
-      </w:r>
-      <w:r>
-        <w:t>amage is the largest single contribution to the final score (24.0) because it is the best area-wide proxy for severity when person-level facts are unknown.</w:t>
+        <w:t>Infrastructure damage: 12 / 36 / 60 raw (ratio 1 : 3 : 5), 4.8 / 14.4 / 24.0 final.</w:t>
+      </w:r>
+      <w:r>
+        <w:t xml:space="preserve"> Damage drives shelter loss, loss of water and power, and the number of entrapments. Low damage means mostly habitable buildings. Medium means partial uninhabitability. High means collapse and mass displacement. The steps are not proportional: the jump from Low to Medium (24 raw) is larger than from Medium to High (24 raw) only in ratio terms (3× then 1.7×), reflecting that any real structural damage changes needs sharply. High damage is the largest single contribution to the final score (24.0) because it is the best area-wide proxy for severity when person-level facts are unknown.</w:t>
       </w:r>
     </w:p>
     <w:p>
@@ -2278,34 +1950,23 @@
         <w:t>Aftershock warning: 40 raw (40% of Impact), 16.0 final.</w:t>
       </w:r>
       <w:r>
-        <w:t xml:space="preserve"> Aftershocks can collapse already weakened bu</w:t>
-      </w:r>
-      <w:r>
-        <w:t>ildings, injure survivors and endanger responders, and push people to stay outdoors, which raises shelter, water and warmth needs. It affects everyone in the area, so it sits in Impact and carries a high weight. An aftershock warning alone is enough to lif</w:t>
-      </w:r>
-      <w:r>
-        <w:t>t even a Low-damage, 10-family request out of Defer / Monitor (minimum score 23.3).</w:t>
+        <w:t xml:space="preserve"> Aftershocks can collapse already weakened buildings, injure survivors and endanger responders, and push people to stay outdoors, which raises shelter, water and warmth needs. It affects everyone in the area, so it sits in Impact and carries a high </w:t>
+      </w:r>
+      <w:r>
+        <w:lastRenderedPageBreak/>
+        <w:t>weight. An aftershock warning alone is enough to lift even a Low-damage, 10-family request out of Defer / Monitor (minimum score 23.3).</w:t>
       </w:r>
     </w:p>
     <w:p>
       <w:r>
         <w:rPr>
-          <w:b w:val="1"/>
-          <w:bCs w:val="1"/>
+          <w:b/>
+          <w:bCs/>
         </w:rPr>
         <w:t>Road damaged: 100 raw, 10.0 final.</w:t>
       </w:r>
       <w:r>
-        <w:rPr/>
-        <w:t xml:space="preserve"> A cut-off area cannot self-resupply, evacuate its injured or be reached by follow-up convoys, so relief must be sized for the delivery ef</w:t>
-      </w:r>
-      <w:r>
-        <w:rPr/>
-        <w:t>fort. The complexity weight is only 10% because road condition describes delivery difficulty, not human suffering. An accessible area with trapped people must outrank an unreachable area with no casualties. A damaged road alone, with no other risk factor, scores 17.3</w:t>
-      </w:r>
-      <w:r>
-        <w:rPr/>
-        <w:t xml:space="preserve"> and does not trigger relief.</w:t>
+        <w:t xml:space="preserve"> A cut-off area cannot self-resupply, evacuate its injured or be reached by follow-up convoys, so relief must be sized for the delivery effort. The complexity weight is only 10% because road condition describes delivery difficulty, not human suffering. An accessible area with trapped people must outrank an unreachable area with no casualties. A damaged road alone, with no other risk factor, scores 17.3 and does not trigger relief.</w:t>
       </w:r>
     </w:p>
     <w:p>
@@ -2316,10 +1977,7 @@
         <w:t>Prior aid received: −10 flat.</w:t>
       </w:r>
       <w:r>
-        <w:t xml:space="preserve"> An area already served has had part of its initial need met. Limited stock should go first to areas with nothing. The deduction is a flat subtraction after the weighted sum, not a multiplier, so i</w:t>
-      </w:r>
-      <w:r>
-        <w:t>t lowers priority by roughly half a band without erasing severe need: any request with both trapped people and medical need still scores at least 24.8 after the penalty and receives at least an Emergency Kit when stock allows.</w:t>
+        <w:t xml:space="preserve"> An area already served has had part of its initial need met. Limited stock should go first to areas with nothing. The deduction is a flat subtraction after the weighted sum, not a multiplier, so it lowers priority by roughly half a band without erasing severe need: any request with both trapped people and medical need still scores at least 24.8 after the penalty and receives at least an Emergency Kit when stock allows.</w:t>
       </w:r>
     </w:p>
     <w:p>
@@ -2327,16 +1985,10 @@
         <w:pStyle w:val="Heading3"/>
       </w:pPr>
       <w:r>
-        <w:rPr/>
         <w:t>4</w:t>
       </w:r>
       <w:r>
-        <w:rPr/>
-        <w:t>.3 Reason for the package th</w:t>
-      </w:r>
-      <w:r>
-        <w:rPr/>
-        <w:t>resholds</w:t>
+        <w:t>.3 Reason for the package thresholds</w:t>
       </w:r>
     </w:p>
     <w:p>
@@ -2384,10 +2036,7 @@
         </w:numPr>
       </w:pPr>
       <w:r>
-        <w:t xml:space="preserve">65 and </w:t>
-      </w:r>
-      <w:r>
-        <w:t>above, Full Relief: the only package that commits two trucks. With default stock it uses 40% of trucks and about 42% of packs, so it is reserved for the top 18.8% of combinations, where several severe factors combine.</w:t>
+        <w:t>65 and above, Full Relief: the only package that commits two trucks. With default stock it uses 40% of trucks and about 42% of packs, so it is reserved for the top 18.8% of combinations, where several severe factors combine.</w:t>
       </w:r>
     </w:p>
     <w:p>
@@ -2395,16 +2044,10 @@
         <w:pStyle w:val="Heading3"/>
       </w:pPr>
       <w:r>
-        <w:rPr/>
         <w:t>4</w:t>
       </w:r>
       <w:r>
-        <w:rPr/>
-        <w:t>.4 Reason for the fallback to a small</w:t>
-      </w:r>
-      <w:r>
-        <w:rPr/>
-        <w:t>er package</w:t>
+        <w:t>.4 Reason for the fallback to a smaller package</w:t>
       </w:r>
     </w:p>
     <w:p>
@@ -2428,10 +2071,7 @@
         </w:numPr>
       </w:pPr>
       <w:r>
-        <w:t>Both trucks and packs are tested at every step, so the system finds the largest packa</w:t>
-      </w:r>
-      <w:r>
-        <w:t>ge the remaining stock can support. Stock is not left idle while an area waits.</w:t>
+        <w:t>Both trucks and packs are tested at every step, so the system finds the largest package the remaining stock can support. Stock is not left idle while an area waits.</w:t>
       </w:r>
     </w:p>
     <w:p>
@@ -2479,10 +2119,7 @@
         </w:numPr>
       </w:pPr>
       <w:r>
-        <w:t>Stock is deducted only after a package is confirmed, so a failed attempt never leaves stock par</w:t>
-      </w:r>
-      <w:r>
-        <w:t>tly consumed.</w:t>
+        <w:t>Stock is deducted only after a package is confirmed, so a failed attempt never leaves stock partly consumed.</w:t>
       </w:r>
     </w:p>
     <w:p>
@@ -2490,11 +2127,9 @@
         <w:pStyle w:val="Heading2"/>
       </w:pPr>
       <w:r>
-        <w:rPr/>
         <w:t>5</w:t>
       </w:r>
       <w:r>
-        <w:rPr/>
         <w:t>. Results</w:t>
       </w:r>
     </w:p>
@@ -2503,11 +2138,9 @@
         <w:pStyle w:val="Heading3"/>
       </w:pPr>
       <w:r>
-        <w:rPr/>
         <w:t>5</w:t>
       </w:r>
       <w:r>
-        <w:rPr/>
         <w:t>.1 Capacity of the default stock</w:t>
       </w:r>
     </w:p>
@@ -2622,6 +2255,7 @@
           </w:tcPr>
           <w:p>
             <w:r>
+              <w:lastRenderedPageBreak/>
               <w:t>Standard Relief</w:t>
             </w:r>
           </w:p>
@@ -2710,19 +2344,15 @@
         <w:pStyle w:val="Heading3"/>
       </w:pPr>
       <w:r>
-        <w:rPr/>
         <w:t>5</w:t>
       </w:r>
       <w:r>
-        <w:rPr/>
         <w:t xml:space="preserve">.2 Verified </w:t>
       </w:r>
       <w:r>
-        <w:rPr/>
         <w:t>behaviors</w:t>
       </w:r>
       <w:r>
-        <w:rPr/>
         <w:t xml:space="preserve"> of the scoring model</w:t>
       </w:r>
     </w:p>
@@ -2735,10 +2365,7 @@
         </w:numPr>
       </w:pPr>
       <w:r>
-        <w:t xml:space="preserve">Trapped people, with no prior aid, score at least 22.3. The request always </w:t>
-      </w:r>
-      <w:r>
-        <w:t>earns at least an Emergency Kit.</w:t>
+        <w:t>Trapped people, with no prior aid, score at least 22.3. The request always earns at least an Emergency Kit.</w:t>
       </w:r>
     </w:p>
     <w:p>
@@ -2790,7 +2417,7 @@
       </w:r>
     </w:p>
     <w:sectPr>
-      <w:pgSz w:w="12240" w:h="15840" w:orient="portrait"/>
+      <w:pgSz w:w="12240" w:h="15840"/>
       <w:pgMar w:top="1440" w:right="1440" w:bottom="1440" w:left="1440" w:header="720" w:footer="720" w:gutter="0"/>
       <w:cols w:space="720"/>
     </w:sectPr>
@@ -3019,7 +2646,7 @@
   <w:docDefaults>
     <w:rPrDefault>
       <w:rPr>
-        <w:rFonts w:ascii="Calibri" w:hAnsi="Calibri" w:eastAsia="Calibri" w:cs="Calibri"/>
+        <w:rFonts w:ascii="Calibri" w:eastAsia="Calibri" w:hAnsi="Calibri" w:cs="Calibri"/>
         <w:sz w:val="22"/>
         <w:szCs w:val="22"/>
         <w:lang w:val="en-US" w:eastAsia="en-US" w:bidi="ar-SA"/>
@@ -3034,14 +2661,14 @@
   <w:latentStyles w:defLockedState="0" w:defUIPriority="99" w:defSemiHidden="0" w:defUnhideWhenUsed="0" w:defQFormat="0" w:count="376">
     <w:lsdException w:name="Normal" w:uiPriority="0" w:qFormat="1"/>
     <w:lsdException w:name="heading 1" w:uiPriority="9" w:qFormat="1"/>
-    <w:lsdException w:name="heading 2" w:uiPriority="9" w:semiHidden="1" w:unhideWhenUsed="1" w:qFormat="1"/>
-    <w:lsdException w:name="heading 3" w:uiPriority="9" w:semiHidden="1" w:unhideWhenUsed="1" w:qFormat="1"/>
-    <w:lsdException w:name="heading 4" w:uiPriority="9" w:semiHidden="1" w:unhideWhenUsed="1" w:qFormat="1"/>
-    <w:lsdException w:name="heading 5" w:uiPriority="9" w:semiHidden="1" w:unhideWhenUsed="1" w:qFormat="1"/>
-    <w:lsdException w:name="heading 6" w:uiPriority="9" w:semiHidden="1" w:unhideWhenUsed="1" w:qFormat="1"/>
-    <w:lsdException w:name="heading 7" w:uiPriority="9" w:semiHidden="1" w:unhideWhenUsed="1" w:qFormat="1"/>
-    <w:lsdException w:name="heading 8" w:uiPriority="9" w:semiHidden="1" w:unhideWhenUsed="1" w:qFormat="1"/>
-    <w:lsdException w:name="heading 9" w:uiPriority="9" w:semiHidden="1" w:unhideWhenUsed="1" w:qFormat="1"/>
+    <w:lsdException w:name="heading 2" w:semiHidden="1" w:uiPriority="9" w:unhideWhenUsed="1" w:qFormat="1"/>
+    <w:lsdException w:name="heading 3" w:semiHidden="1" w:uiPriority="9" w:unhideWhenUsed="1" w:qFormat="1"/>
+    <w:lsdException w:name="heading 4" w:semiHidden="1" w:uiPriority="9" w:unhideWhenUsed="1" w:qFormat="1"/>
+    <w:lsdException w:name="heading 5" w:semiHidden="1" w:uiPriority="9" w:unhideWhenUsed="1" w:qFormat="1"/>
+    <w:lsdException w:name="heading 6" w:semiHidden="1" w:uiPriority="9" w:unhideWhenUsed="1" w:qFormat="1"/>
+    <w:lsdException w:name="heading 7" w:semiHidden="1" w:uiPriority="9" w:unhideWhenUsed="1" w:qFormat="1"/>
+    <w:lsdException w:name="heading 8" w:semiHidden="1" w:uiPriority="9" w:unhideWhenUsed="1" w:qFormat="1"/>
+    <w:lsdException w:name="heading 9" w:semiHidden="1" w:uiPriority="9" w:unhideWhenUsed="1" w:qFormat="1"/>
     <w:lsdException w:name="index 1" w:semiHidden="1" w:unhideWhenUsed="1"/>
     <w:lsdException w:name="index 2" w:semiHidden="1" w:unhideWhenUsed="1"/>
     <w:lsdException w:name="index 3" w:semiHidden="1" w:unhideWhenUsed="1"/>
@@ -3051,22 +2678,22 @@
     <w:lsdException w:name="index 7" w:semiHidden="1" w:unhideWhenUsed="1"/>
     <w:lsdException w:name="index 8" w:semiHidden="1" w:unhideWhenUsed="1"/>
     <w:lsdException w:name="index 9" w:semiHidden="1" w:unhideWhenUsed="1"/>
-    <w:lsdException w:name="toc 1" w:uiPriority="39" w:semiHidden="1" w:unhideWhenUsed="1"/>
-    <w:lsdException w:name="toc 2" w:uiPriority="39" w:semiHidden="1" w:unhideWhenUsed="1"/>
-    <w:lsdException w:name="toc 3" w:uiPriority="39" w:semiHidden="1" w:unhideWhenUsed="1"/>
-    <w:lsdException w:name="toc 4" w:uiPriority="39" w:semiHidden="1" w:unhideWhenUsed="1"/>
-    <w:lsdException w:name="toc 5" w:uiPriority="39" w:semiHidden="1" w:unhideWhenUsed="1"/>
-    <w:lsdException w:name="toc 6" w:uiPriority="39" w:semiHidden="1" w:unhideWhenUsed="1"/>
-    <w:lsdException w:name="toc 7" w:uiPriority="39" w:semiHidden="1" w:unhideWhenUsed="1"/>
-    <w:lsdException w:name="toc 8" w:uiPriority="39" w:semiHidden="1" w:unhideWhenUsed="1"/>
-    <w:lsdException w:name="toc 9" w:uiPriority="39" w:semiHidden="1" w:unhideWhenUsed="1"/>
+    <w:lsdException w:name="toc 1" w:semiHidden="1" w:uiPriority="39" w:unhideWhenUsed="1"/>
+    <w:lsdException w:name="toc 2" w:semiHidden="1" w:uiPriority="39" w:unhideWhenUsed="1"/>
+    <w:lsdException w:name="toc 3" w:semiHidden="1" w:uiPriority="39" w:unhideWhenUsed="1"/>
+    <w:lsdException w:name="toc 4" w:semiHidden="1" w:uiPriority="39" w:unhideWhenUsed="1"/>
+    <w:lsdException w:name="toc 5" w:semiHidden="1" w:uiPriority="39" w:unhideWhenUsed="1"/>
+    <w:lsdException w:name="toc 6" w:semiHidden="1" w:uiPriority="39" w:unhideWhenUsed="1"/>
+    <w:lsdException w:name="toc 7" w:semiHidden="1" w:uiPriority="39" w:unhideWhenUsed="1"/>
+    <w:lsdException w:name="toc 8" w:semiHidden="1" w:uiPriority="39" w:unhideWhenUsed="1"/>
+    <w:lsdException w:name="toc 9" w:semiHidden="1" w:uiPriority="39" w:unhideWhenUsed="1"/>
     <w:lsdException w:name="Normal Indent" w:semiHidden="1" w:unhideWhenUsed="1"/>
     <w:lsdException w:name="footnote text" w:semiHidden="1" w:unhideWhenUsed="1"/>
     <w:lsdException w:name="annotation text" w:semiHidden="1" w:unhideWhenUsed="1"/>
     <w:lsdException w:name="header" w:semiHidden="1" w:unhideWhenUsed="1"/>
     <w:lsdException w:name="footer" w:semiHidden="1" w:unhideWhenUsed="1"/>
     <w:lsdException w:name="index heading" w:semiHidden="1" w:unhideWhenUsed="1"/>
-    <w:lsdException w:name="caption" w:uiPriority="35" w:semiHidden="1" w:unhideWhenUsed="1" w:qFormat="1"/>
+    <w:lsdException w:name="caption" w:semiHidden="1" w:uiPriority="35" w:unhideWhenUsed="1" w:qFormat="1"/>
     <w:lsdException w:name="table of figures" w:semiHidden="1" w:unhideWhenUsed="1"/>
     <w:lsdException w:name="envelope address" w:semiHidden="1" w:unhideWhenUsed="1"/>
     <w:lsdException w:name="envelope return" w:semiHidden="1" w:unhideWhenUsed="1"/>
@@ -3097,7 +2724,7 @@
     <w:lsdException w:name="Title" w:uiPriority="10" w:qFormat="1"/>
     <w:lsdException w:name="Closing" w:semiHidden="1" w:unhideWhenUsed="1"/>
     <w:lsdException w:name="Signature" w:semiHidden="1" w:unhideWhenUsed="1"/>
-    <w:lsdException w:name="Default Paragraph Font" w:uiPriority="1" w:semiHidden="1" w:unhideWhenUsed="1"/>
+    <w:lsdException w:name="Default Paragraph Font" w:semiHidden="1" w:uiPriority="1" w:unhideWhenUsed="1"/>
     <w:lsdException w:name="Body Text" w:semiHidden="1" w:unhideWhenUsed="1"/>
     <w:lsdException w:name="Body Text Indent" w:semiHidden="1" w:unhideWhenUsed="1"/>
     <w:lsdException w:name="List Continue" w:semiHidden="1" w:unhideWhenUsed="1"/>
@@ -3297,8 +2924,8 @@
     <w:lsdException w:name="Subtle Reference" w:uiPriority="31" w:qFormat="1"/>
     <w:lsdException w:name="Intense Reference" w:uiPriority="32" w:qFormat="1"/>
     <w:lsdException w:name="Book Title" w:uiPriority="33" w:qFormat="1"/>
-    <w:lsdException w:name="Bibliography" w:uiPriority="37" w:semiHidden="1" w:unhideWhenUsed="1"/>
-    <w:lsdException w:name="TOC Heading" w:uiPriority="39" w:semiHidden="1" w:unhideWhenUsed="1" w:qFormat="1"/>
+    <w:lsdException w:name="Bibliography" w:semiHidden="1" w:uiPriority="37" w:unhideWhenUsed="1"/>
+    <w:lsdException w:name="TOC Heading" w:semiHidden="1" w:uiPriority="39" w:unhideWhenUsed="1" w:qFormat="1"/>
     <w:lsdException w:name="Plain Table 1" w:uiPriority="41"/>
     <w:lsdException w:name="Plain Table 2" w:uiPriority="42"/>
     <w:lsdException w:name="Plain Table 3" w:uiPriority="43"/>
@@ -3409,7 +3036,7 @@
     <w:lsdException w:name="Unresolved Mention" w:semiHidden="1" w:unhideWhenUsed="1"/>
     <w:lsdException w:name="Smart Link" w:semiHidden="1" w:unhideWhenUsed="1"/>
   </w:latentStyles>
-  <w:style w:type="paragraph" w:styleId="Normal" w:default="1">
+  <w:style w:type="paragraph" w:default="1" w:styleId="Normal">
     <w:name w:val="Normal"/>
     <w:qFormat/>
   </w:style>
@@ -3511,13 +3138,13 @@
       <w:i/>
     </w:rPr>
   </w:style>
-  <w:style w:type="character" w:styleId="DefaultParagraphFont" w:default="1">
+  <w:style w:type="character" w:default="1" w:styleId="DefaultParagraphFont">
     <w:name w:val="Default Paragraph Font"/>
     <w:uiPriority w:val="1"/>
     <w:semiHidden/>
     <w:unhideWhenUsed/>
   </w:style>
-  <w:style w:type="table" w:styleId="TableNormal" w:default="1">
+  <w:style w:type="table" w:default="1" w:styleId="TableNormal">
     <w:name w:val="Normal Table"/>
     <w:uiPriority w:val="99"/>
     <w:semiHidden/>
@@ -3532,7 +3159,7 @@
       </w:tblCellMar>
     </w:tblPr>
   </w:style>
-  <w:style w:type="numbering" w:styleId="NoList" w:default="1">
+  <w:style w:type="numbering" w:default="1" w:styleId="NoList">
     <w:name w:val="No List"/>
     <w:uiPriority w:val="99"/>
     <w:semiHidden/>
@@ -3558,7 +3185,7 @@
     <w:qFormat/>
     <w:pPr>
       <w:pBdr>
-        <w:left w:val="single" w:color="A0A0A0" w:sz="12" w:space="8"/>
+        <w:left w:val="single" w:sz="12" w:space="8" w:color="A0A0A0"/>
       </w:pBdr>
       <w:ind w:left="720" w:right="720"/>
     </w:pPr>
@@ -3567,7 +3194,7 @@
       <w:color w:val="404040"/>
     </w:rPr>
   </w:style>
-  <w:style w:type="paragraph" w:styleId="Code" w:customStyle="1">
+  <w:style w:type="paragraph" w:customStyle="1" w:styleId="Code">
     <w:name w:val="Code"/>
     <w:basedOn w:val="Normal"/>
     <w:link w:val="CodeChar"/>
@@ -3577,15 +3204,15 @@
       <w:contextualSpacing/>
     </w:pPr>
     <w:rPr>
-      <w:rFonts w:ascii="Consolas" w:hAnsi="Consolas" w:eastAsia="Consolas" w:cs="Consolas"/>
+      <w:rFonts w:ascii="Consolas" w:eastAsia="Consolas" w:hAnsi="Consolas" w:cs="Consolas"/>
       <w:sz w:val="20"/>
     </w:rPr>
   </w:style>
-  <w:style w:type="character" w:styleId="CodeChar" w:customStyle="1">
+  <w:style w:type="character" w:customStyle="1" w:styleId="CodeChar">
     <w:name w:val="Code Char"/>
     <w:link w:val="Code"/>
     <w:rPr>
-      <w:rFonts w:ascii="Consolas" w:hAnsi="Consolas" w:eastAsia="Consolas" w:cs="Consolas"/>
+      <w:rFonts w:ascii="Consolas" w:eastAsia="Consolas" w:hAnsi="Consolas" w:cs="Consolas"/>
       <w:sz w:val="20"/>
       <w:shd w:val="clear" w:color="auto" w:fill="F5F5F5"/>
     </w:rPr>
@@ -3629,12 +3256,12 @@
     <w:basedOn w:val="TableNormal"/>
     <w:tblPr>
       <w:tblBorders>
-        <w:top w:val="single" w:color="auto" w:sz="4" w:space="0"/>
-        <w:left w:val="single" w:color="auto" w:sz="4" w:space="0"/>
-        <w:bottom w:val="single" w:color="auto" w:sz="4" w:space="0"/>
-        <w:right w:val="single" w:color="auto" w:sz="4" w:space="0"/>
-        <w:insideH w:val="single" w:color="auto" w:sz="4" w:space="0"/>
-        <w:insideV w:val="single" w:color="auto" w:sz="4" w:space="0"/>
+        <w:top w:val="single" w:sz="4" w:space="0" w:color="auto"/>
+        <w:left w:val="single" w:sz="4" w:space="0" w:color="auto"/>
+        <w:bottom w:val="single" w:sz="4" w:space="0" w:color="auto"/>
+        <w:right w:val="single" w:sz="4" w:space="0" w:color="auto"/>
+        <w:insideH w:val="single" w:sz="4" w:space="0" w:color="auto"/>
+        <w:insideV w:val="single" w:sz="4" w:space="0" w:color="auto"/>
       </w:tblBorders>
     </w:tblPr>
   </w:style>
@@ -3666,7 +3293,7 @@
 </file>
 
 <file path=word/theme/theme1.xml><?xml version="1.0" encoding="utf-8"?>
-<a:theme xmlns:a="http://schemas.openxmlformats.org/drawingml/2006/main" xmlns:thm15="http://schemas.microsoft.com/office/thememl/2012/main" name="Office Theme">
+<a:theme xmlns:a="http://schemas.openxmlformats.org/drawingml/2006/main" name="Office Theme">
   <a:themeElements>
     <a:clrScheme name="Office">
       <a:dk1>

</xml_diff>